<commit_message>
feat(cv): restore detailed project descriptions & add Cursos y Conocimientos section
</commit_message>
<xml_diff>
--- a/EmerzonPascualCV2026.docx
+++ b/EmerzonPascualCV2026.docx
@@ -7,7 +7,7 @@
       <w:pPr>
         <w:shd w:val="clear" w:color="auto" w:fill="0F172A"/>
         <w:jc w:val="center"/>
-        <w:divId w:val="410272418"/>
+        <w:divId w:val="241574767"/>
         <w:rPr>
           <w:rFonts w:ascii="Segoe UI" w:eastAsia="Times New Roman" w:hAnsi="Segoe UI" w:cs="Segoe UI"/>
           <w:color w:val="F8FAFC"/>
@@ -24,7 +24,7 @@
           <w:szCs w:val="15"/>
         </w:rPr>
         <w:drawing>
-          <wp:inline distT="0" distB="0" distL="0" distR="0" wp14:anchorId="2202995F" wp14:editId="58C287AF">
+          <wp:inline distT="0" distB="0" distL="0" distR="0" wp14:anchorId="0CB9521E" wp14:editId="3C900E22">
             <wp:extent cx="1238250" cy="1238250"/>
             <wp:effectExtent l="0" t="0" r="0" b="0"/>
             <wp:docPr id="1" name="Imagen 1" descr="Rony Emerzon Pascual"/>
@@ -76,7 +76,7 @@
     <w:p>
       <w:pPr>
         <w:shd w:val="clear" w:color="auto" w:fill="0F172A"/>
-        <w:divId w:val="377163902"/>
+        <w:divId w:val="1154877360"/>
         <w:rPr>
           <w:rFonts w:ascii="Segoe UI" w:eastAsia="Times New Roman" w:hAnsi="Segoe UI" w:cs="Segoe UI"/>
           <w:b/>
@@ -105,7 +105,7 @@
     <w:p>
       <w:pPr>
         <w:shd w:val="clear" w:color="auto" w:fill="0F172A"/>
-        <w:divId w:val="1306280215"/>
+        <w:divId w:val="1732269885"/>
         <w:rPr>
           <w:rFonts w:ascii="Segoe UI" w:eastAsia="Times New Roman" w:hAnsi="Segoe UI" w:cs="Segoe UI"/>
           <w:color w:val="CBD5E1"/>
@@ -121,8 +121,8 @@
           <w:caps/>
           <w:color w:val="FFFFFF"/>
           <w:spacing w:val="5"/>
-          <w:sz w:val="14"/>
-          <w:szCs w:val="14"/>
+          <w:sz w:val="13"/>
+          <w:szCs w:val="13"/>
         </w:rPr>
         <w:t>Teléfono</w:t>
       </w:r>
@@ -139,7 +139,7 @@
     <w:p>
       <w:pPr>
         <w:shd w:val="clear" w:color="auto" w:fill="0F172A"/>
-        <w:divId w:val="685253141"/>
+        <w:divId w:val="1345088846"/>
         <w:rPr>
           <w:rFonts w:ascii="Segoe UI" w:eastAsia="Times New Roman" w:hAnsi="Segoe UI" w:cs="Segoe UI"/>
           <w:color w:val="CBD5E1"/>
@@ -155,8 +155,8 @@
           <w:caps/>
           <w:color w:val="FFFFFF"/>
           <w:spacing w:val="5"/>
-          <w:sz w:val="14"/>
-          <w:szCs w:val="14"/>
+          <w:sz w:val="13"/>
+          <w:szCs w:val="13"/>
         </w:rPr>
         <w:t>Email</w:t>
       </w:r>
@@ -173,7 +173,7 @@
     <w:p>
       <w:pPr>
         <w:shd w:val="clear" w:color="auto" w:fill="0F172A"/>
-        <w:divId w:val="74982932"/>
+        <w:divId w:val="1776899486"/>
         <w:rPr>
           <w:rFonts w:ascii="Segoe UI" w:eastAsia="Times New Roman" w:hAnsi="Segoe UI" w:cs="Segoe UI"/>
           <w:color w:val="CBD5E1"/>
@@ -189,8 +189,42 @@
           <w:caps/>
           <w:color w:val="FFFFFF"/>
           <w:spacing w:val="5"/>
-          <w:sz w:val="14"/>
-          <w:szCs w:val="14"/>
+          <w:sz w:val="13"/>
+          <w:szCs w:val="13"/>
+        </w:rPr>
+        <w:t>DNI</w:t>
+      </w:r>
+      <w:r>
+        <w:rPr>
+          <w:rFonts w:ascii="Segoe UI" w:eastAsia="Times New Roman" w:hAnsi="Segoe UI" w:cs="Segoe UI"/>
+          <w:color w:val="CBD5E1"/>
+          <w:sz w:val="14"/>
+          <w:szCs w:val="14"/>
+        </w:rPr>
+        <w:t>48276866</w:t>
+      </w:r>
+    </w:p>
+    <w:p>
+      <w:pPr>
+        <w:shd w:val="clear" w:color="auto" w:fill="0F172A"/>
+        <w:divId w:val="1016734187"/>
+        <w:rPr>
+          <w:rFonts w:ascii="Segoe UI" w:eastAsia="Times New Roman" w:hAnsi="Segoe UI" w:cs="Segoe UI"/>
+          <w:color w:val="CBD5E1"/>
+          <w:sz w:val="14"/>
+          <w:szCs w:val="14"/>
+        </w:rPr>
+      </w:pPr>
+      <w:r>
+        <w:rPr>
+          <w:rFonts w:ascii="Segoe UI" w:eastAsia="Times New Roman" w:hAnsi="Segoe UI" w:cs="Segoe UI"/>
+          <w:b/>
+          <w:bCs/>
+          <w:caps/>
+          <w:color w:val="FFFFFF"/>
+          <w:spacing w:val="5"/>
+          <w:sz w:val="13"/>
+          <w:szCs w:val="13"/>
         </w:rPr>
         <w:t>LinkedIn</w:t>
       </w:r>
@@ -209,7 +243,7 @@
     <w:p>
       <w:pPr>
         <w:shd w:val="clear" w:color="auto" w:fill="0F172A"/>
-        <w:divId w:val="1758406790"/>
+        <w:divId w:val="966740782"/>
         <w:rPr>
           <w:rFonts w:ascii="Segoe UI" w:eastAsia="Times New Roman" w:hAnsi="Segoe UI" w:cs="Segoe UI"/>
           <w:color w:val="CBD5E1"/>
@@ -225,8 +259,8 @@
           <w:caps/>
           <w:color w:val="FFFFFF"/>
           <w:spacing w:val="5"/>
-          <w:sz w:val="14"/>
-          <w:szCs w:val="14"/>
+          <w:sz w:val="13"/>
+          <w:szCs w:val="13"/>
         </w:rPr>
         <w:t>Portafolio GitHub</w:t>
       </w:r>
@@ -245,7 +279,7 @@
     <w:p>
       <w:pPr>
         <w:shd w:val="clear" w:color="auto" w:fill="0F172A"/>
-        <w:divId w:val="850220235"/>
+        <w:divId w:val="729305031"/>
         <w:rPr>
           <w:rFonts w:ascii="Segoe UI" w:eastAsia="Times New Roman" w:hAnsi="Segoe UI" w:cs="Segoe UI"/>
           <w:b/>
@@ -274,7 +308,7 @@
     <w:p>
       <w:pPr>
         <w:shd w:val="clear" w:color="auto" w:fill="0F172A"/>
-        <w:divId w:val="202207997"/>
+        <w:divId w:val="806044709"/>
         <w:rPr>
           <w:rFonts w:ascii="Segoe UI" w:eastAsia="Times New Roman" w:hAnsi="Segoe UI" w:cs="Segoe UI"/>
           <w:color w:val="F8FAFC"/>
@@ -542,7 +576,7 @@
     <w:p>
       <w:pPr>
         <w:shd w:val="clear" w:color="auto" w:fill="0F172A"/>
-        <w:divId w:val="1831482392"/>
+        <w:divId w:val="595986093"/>
         <w:rPr>
           <w:rFonts w:ascii="Segoe UI" w:eastAsia="Times New Roman" w:hAnsi="Segoe UI" w:cs="Segoe UI"/>
           <w:b/>
@@ -565,30 +599,364 @@
           <w:sz w:val="15"/>
           <w:szCs w:val="15"/>
         </w:rPr>
-        <w:t>Educación &amp; Certificaciones</w:t>
-      </w:r>
-    </w:p>
-    <w:p>
-      <w:pPr>
+        <w:t>Cursos y Conocimientos</w:t>
+      </w:r>
+    </w:p>
+    <w:p>
+      <w:pPr>
+        <w:numPr>
+          <w:ilvl w:val="0"/>
+          <w:numId w:val="1"/>
+        </w:numPr>
         <w:shd w:val="clear" w:color="auto" w:fill="0F172A"/>
-        <w:divId w:val="299727276"/>
+        <w:spacing w:before="100" w:beforeAutospacing="1" w:after="27"/>
+        <w:divId w:val="1553076001"/>
+        <w:rPr>
+          <w:rFonts w:ascii="Segoe UI" w:eastAsia="Times New Roman" w:hAnsi="Segoe UI" w:cs="Segoe UI"/>
+          <w:color w:val="CBD5E1"/>
+          <w:sz w:val="14"/>
+          <w:szCs w:val="14"/>
+        </w:rPr>
+      </w:pPr>
+      <w:r>
+        <w:rPr>
+          <w:rFonts w:ascii="Segoe UI" w:eastAsia="Times New Roman" w:hAnsi="Segoe UI" w:cs="Segoe UI"/>
+          <w:color w:val="CBD5E1"/>
+          <w:sz w:val="14"/>
+          <w:szCs w:val="14"/>
+        </w:rPr>
+        <w:t xml:space="preserve">• </w:t>
+      </w:r>
+      <w:r>
         <w:rPr>
           <w:rFonts w:ascii="Segoe UI" w:eastAsia="Times New Roman" w:hAnsi="Segoe UI" w:cs="Segoe UI"/>
           <w:b/>
           <w:bCs/>
           <w:color w:val="FFFFFF"/>
-          <w:sz w:val="15"/>
-          <w:szCs w:val="15"/>
-        </w:rPr>
-      </w:pPr>
+          <w:sz w:val="14"/>
+          <w:szCs w:val="14"/>
+        </w:rPr>
+        <w:t>Cloud Computing</w:t>
+      </w:r>
+      <w:r>
+        <w:rPr>
+          <w:rFonts w:ascii="Segoe UI" w:eastAsia="Times New Roman" w:hAnsi="Segoe UI" w:cs="Segoe UI"/>
+          <w:color w:val="CBD5E1"/>
+          <w:sz w:val="14"/>
+          <w:szCs w:val="14"/>
+        </w:rPr>
+        <w:t xml:space="preserve"> (AWS &amp; Azure)</w:t>
+      </w:r>
+    </w:p>
+    <w:p>
+      <w:pPr>
+        <w:numPr>
+          <w:ilvl w:val="0"/>
+          <w:numId w:val="1"/>
+        </w:numPr>
+        <w:shd w:val="clear" w:color="auto" w:fill="0F172A"/>
+        <w:spacing w:before="100" w:beforeAutospacing="1" w:after="27"/>
+        <w:divId w:val="1553076001"/>
+        <w:rPr>
+          <w:rFonts w:ascii="Segoe UI" w:eastAsia="Times New Roman" w:hAnsi="Segoe UI" w:cs="Segoe UI"/>
+          <w:color w:val="CBD5E1"/>
+          <w:sz w:val="14"/>
+          <w:szCs w:val="14"/>
+        </w:rPr>
+      </w:pPr>
+      <w:r>
+        <w:rPr>
+          <w:rFonts w:ascii="Segoe UI" w:eastAsia="Times New Roman" w:hAnsi="Segoe UI" w:cs="Segoe UI"/>
+          <w:color w:val="CBD5E1"/>
+          <w:sz w:val="14"/>
+          <w:szCs w:val="14"/>
+        </w:rPr>
+        <w:t xml:space="preserve">• </w:t>
+      </w:r>
       <w:r>
         <w:rPr>
           <w:rFonts w:ascii="Segoe UI" w:eastAsia="Times New Roman" w:hAnsi="Segoe UI" w:cs="Segoe UI"/>
           <w:b/>
           <w:bCs/>
           <w:color w:val="FFFFFF"/>
-          <w:sz w:val="15"/>
-          <w:szCs w:val="15"/>
+          <w:sz w:val="14"/>
+          <w:szCs w:val="14"/>
+        </w:rPr>
+        <w:t>Node.js &amp; Express</w:t>
+      </w:r>
+    </w:p>
+    <w:p>
+      <w:pPr>
+        <w:numPr>
+          <w:ilvl w:val="0"/>
+          <w:numId w:val="1"/>
+        </w:numPr>
+        <w:shd w:val="clear" w:color="auto" w:fill="0F172A"/>
+        <w:spacing w:before="100" w:beforeAutospacing="1" w:after="27"/>
+        <w:divId w:val="1553076001"/>
+        <w:rPr>
+          <w:rFonts w:ascii="Segoe UI" w:eastAsia="Times New Roman" w:hAnsi="Segoe UI" w:cs="Segoe UI"/>
+          <w:color w:val="CBD5E1"/>
+          <w:sz w:val="14"/>
+          <w:szCs w:val="14"/>
+        </w:rPr>
+      </w:pPr>
+      <w:r>
+        <w:rPr>
+          <w:rFonts w:ascii="Segoe UI" w:eastAsia="Times New Roman" w:hAnsi="Segoe UI" w:cs="Segoe UI"/>
+          <w:color w:val="CBD5E1"/>
+          <w:sz w:val="14"/>
+          <w:szCs w:val="14"/>
+        </w:rPr>
+        <w:t xml:space="preserve">• </w:t>
+      </w:r>
+      <w:r>
+        <w:rPr>
+          <w:rFonts w:ascii="Segoe UI" w:eastAsia="Times New Roman" w:hAnsi="Segoe UI" w:cs="Segoe UI"/>
+          <w:b/>
+          <w:bCs/>
+          <w:color w:val="FFFFFF"/>
+          <w:sz w:val="14"/>
+          <w:szCs w:val="14"/>
+        </w:rPr>
+        <w:t>Programación .NET &amp; C#</w:t>
+      </w:r>
+    </w:p>
+    <w:p>
+      <w:pPr>
+        <w:numPr>
+          <w:ilvl w:val="0"/>
+          <w:numId w:val="1"/>
+        </w:numPr>
+        <w:shd w:val="clear" w:color="auto" w:fill="0F172A"/>
+        <w:spacing w:before="100" w:beforeAutospacing="1" w:after="27"/>
+        <w:divId w:val="1553076001"/>
+        <w:rPr>
+          <w:rFonts w:ascii="Segoe UI" w:eastAsia="Times New Roman" w:hAnsi="Segoe UI" w:cs="Segoe UI"/>
+          <w:color w:val="CBD5E1"/>
+          <w:sz w:val="14"/>
+          <w:szCs w:val="14"/>
+        </w:rPr>
+      </w:pPr>
+      <w:r>
+        <w:rPr>
+          <w:rFonts w:ascii="Segoe UI" w:eastAsia="Times New Roman" w:hAnsi="Segoe UI" w:cs="Segoe UI"/>
+          <w:color w:val="CBD5E1"/>
+          <w:sz w:val="14"/>
+          <w:szCs w:val="14"/>
+        </w:rPr>
+        <w:t xml:space="preserve">• </w:t>
+      </w:r>
+      <w:r>
+        <w:rPr>
+          <w:rFonts w:ascii="Segoe UI" w:eastAsia="Times New Roman" w:hAnsi="Segoe UI" w:cs="Segoe UI"/>
+          <w:b/>
+          <w:bCs/>
+          <w:color w:val="FFFFFF"/>
+          <w:sz w:val="14"/>
+          <w:szCs w:val="14"/>
+        </w:rPr>
+        <w:t>Java &amp; Spring Boot Avanzado</w:t>
+      </w:r>
+    </w:p>
+    <w:p>
+      <w:pPr>
+        <w:numPr>
+          <w:ilvl w:val="0"/>
+          <w:numId w:val="1"/>
+        </w:numPr>
+        <w:shd w:val="clear" w:color="auto" w:fill="0F172A"/>
+        <w:spacing w:before="100" w:beforeAutospacing="1" w:after="27"/>
+        <w:divId w:val="1553076001"/>
+        <w:rPr>
+          <w:rFonts w:ascii="Segoe UI" w:eastAsia="Times New Roman" w:hAnsi="Segoe UI" w:cs="Segoe UI"/>
+          <w:color w:val="CBD5E1"/>
+          <w:sz w:val="14"/>
+          <w:szCs w:val="14"/>
+        </w:rPr>
+      </w:pPr>
+      <w:r>
+        <w:rPr>
+          <w:rFonts w:ascii="Segoe UI" w:eastAsia="Times New Roman" w:hAnsi="Segoe UI" w:cs="Segoe UI"/>
+          <w:color w:val="CBD5E1"/>
+          <w:sz w:val="14"/>
+          <w:szCs w:val="14"/>
+        </w:rPr>
+        <w:t xml:space="preserve">• </w:t>
+      </w:r>
+      <w:r>
+        <w:rPr>
+          <w:rFonts w:ascii="Segoe UI" w:eastAsia="Times New Roman" w:hAnsi="Segoe UI" w:cs="Segoe UI"/>
+          <w:b/>
+          <w:bCs/>
+          <w:color w:val="FFFFFF"/>
+          <w:sz w:val="14"/>
+          <w:szCs w:val="14"/>
+        </w:rPr>
+        <w:t>Angular &amp; TypeScript</w:t>
+      </w:r>
+    </w:p>
+    <w:p>
+      <w:pPr>
+        <w:numPr>
+          <w:ilvl w:val="0"/>
+          <w:numId w:val="1"/>
+        </w:numPr>
+        <w:shd w:val="clear" w:color="auto" w:fill="0F172A"/>
+        <w:spacing w:before="100" w:beforeAutospacing="1" w:after="27"/>
+        <w:divId w:val="1553076001"/>
+        <w:rPr>
+          <w:rFonts w:ascii="Segoe UI" w:eastAsia="Times New Roman" w:hAnsi="Segoe UI" w:cs="Segoe UI"/>
+          <w:color w:val="CBD5E1"/>
+          <w:sz w:val="14"/>
+          <w:szCs w:val="14"/>
+        </w:rPr>
+      </w:pPr>
+      <w:r>
+        <w:rPr>
+          <w:rFonts w:ascii="Segoe UI" w:eastAsia="Times New Roman" w:hAnsi="Segoe UI" w:cs="Segoe UI"/>
+          <w:color w:val="CBD5E1"/>
+          <w:sz w:val="14"/>
+          <w:szCs w:val="14"/>
+        </w:rPr>
+        <w:t xml:space="preserve">• </w:t>
+      </w:r>
+      <w:r>
+        <w:rPr>
+          <w:rFonts w:ascii="Segoe UI" w:eastAsia="Times New Roman" w:hAnsi="Segoe UI" w:cs="Segoe UI"/>
+          <w:b/>
+          <w:bCs/>
+          <w:color w:val="FFFFFF"/>
+          <w:sz w:val="14"/>
+          <w:szCs w:val="14"/>
+        </w:rPr>
+        <w:t>Kotlin &amp; Android Studio</w:t>
+      </w:r>
+    </w:p>
+    <w:p>
+      <w:pPr>
+        <w:numPr>
+          <w:ilvl w:val="0"/>
+          <w:numId w:val="1"/>
+        </w:numPr>
+        <w:shd w:val="clear" w:color="auto" w:fill="0F172A"/>
+        <w:spacing w:before="100" w:beforeAutospacing="1" w:after="27"/>
+        <w:divId w:val="1553076001"/>
+        <w:rPr>
+          <w:rFonts w:ascii="Segoe UI" w:eastAsia="Times New Roman" w:hAnsi="Segoe UI" w:cs="Segoe UI"/>
+          <w:color w:val="CBD5E1"/>
+          <w:sz w:val="14"/>
+          <w:szCs w:val="14"/>
+        </w:rPr>
+      </w:pPr>
+      <w:r>
+        <w:rPr>
+          <w:rFonts w:ascii="Segoe UI" w:eastAsia="Times New Roman" w:hAnsi="Segoe UI" w:cs="Segoe UI"/>
+          <w:color w:val="CBD5E1"/>
+          <w:sz w:val="14"/>
+          <w:szCs w:val="14"/>
+        </w:rPr>
+        <w:t xml:space="preserve">• </w:t>
+      </w:r>
+      <w:r>
+        <w:rPr>
+          <w:rFonts w:ascii="Segoe UI" w:eastAsia="Times New Roman" w:hAnsi="Segoe UI" w:cs="Segoe UI"/>
+          <w:b/>
+          <w:bCs/>
+          <w:color w:val="FFFFFF"/>
+          <w:sz w:val="14"/>
+          <w:szCs w:val="14"/>
+        </w:rPr>
+        <w:t>SQL Server &amp; PostgreSQL</w:t>
+      </w:r>
+    </w:p>
+    <w:p>
+      <w:pPr>
+        <w:numPr>
+          <w:ilvl w:val="0"/>
+          <w:numId w:val="1"/>
+        </w:numPr>
+        <w:shd w:val="clear" w:color="auto" w:fill="0F172A"/>
+        <w:spacing w:before="100" w:beforeAutospacing="1" w:after="27"/>
+        <w:divId w:val="1553076001"/>
+        <w:rPr>
+          <w:rFonts w:ascii="Segoe UI" w:eastAsia="Times New Roman" w:hAnsi="Segoe UI" w:cs="Segoe UI"/>
+          <w:color w:val="CBD5E1"/>
+          <w:sz w:val="14"/>
+          <w:szCs w:val="14"/>
+        </w:rPr>
+      </w:pPr>
+      <w:r>
+        <w:rPr>
+          <w:rFonts w:ascii="Segoe UI" w:eastAsia="Times New Roman" w:hAnsi="Segoe UI" w:cs="Segoe UI"/>
+          <w:color w:val="CBD5E1"/>
+          <w:sz w:val="14"/>
+          <w:szCs w:val="14"/>
+        </w:rPr>
+        <w:t xml:space="preserve">• </w:t>
+      </w:r>
+      <w:r>
+        <w:rPr>
+          <w:rFonts w:ascii="Segoe UI" w:eastAsia="Times New Roman" w:hAnsi="Segoe UI" w:cs="Segoe UI"/>
+          <w:b/>
+          <w:bCs/>
+          <w:color w:val="FFFFFF"/>
+          <w:sz w:val="14"/>
+          <w:szCs w:val="14"/>
+        </w:rPr>
+        <w:t>Python para Automatización</w:t>
+      </w:r>
+    </w:p>
+    <w:p>
+      <w:pPr>
+        <w:shd w:val="clear" w:color="auto" w:fill="0F172A"/>
+        <w:divId w:val="1593273160"/>
+        <w:rPr>
+          <w:rFonts w:ascii="Segoe UI" w:eastAsia="Times New Roman" w:hAnsi="Segoe UI" w:cs="Segoe UI"/>
+          <w:b/>
+          <w:bCs/>
+          <w:caps/>
+          <w:color w:val="38BDF8"/>
+          <w:spacing w:val="9"/>
+          <w:sz w:val="15"/>
+          <w:szCs w:val="15"/>
+        </w:rPr>
+      </w:pPr>
+      <w:r>
+        <w:rPr>
+          <w:rFonts w:ascii="Segoe UI" w:eastAsia="Times New Roman" w:hAnsi="Segoe UI" w:cs="Segoe UI"/>
+          <w:b/>
+          <w:bCs/>
+          <w:caps/>
+          <w:color w:val="38BDF8"/>
+          <w:spacing w:val="9"/>
+          <w:sz w:val="15"/>
+          <w:szCs w:val="15"/>
+        </w:rPr>
+        <w:t>Educación y Certificaciones</w:t>
+      </w:r>
+    </w:p>
+    <w:p>
+      <w:pPr>
+        <w:shd w:val="clear" w:color="auto" w:fill="0F172A"/>
+        <w:divId w:val="1149446106"/>
+        <w:rPr>
+          <w:rFonts w:ascii="Segoe UI" w:eastAsia="Times New Roman" w:hAnsi="Segoe UI" w:cs="Segoe UI"/>
+          <w:b/>
+          <w:bCs/>
+          <w:color w:val="FFFFFF"/>
+          <w:sz w:val="14"/>
+          <w:szCs w:val="14"/>
+        </w:rPr>
+      </w:pPr>
+      <w:r>
+        <w:rPr>
+          <w:rFonts w:ascii="Segoe UI" w:eastAsia="Times New Roman" w:hAnsi="Segoe UI" w:cs="Segoe UI"/>
+          <w:b/>
+          <w:bCs/>
+          <w:color w:val="FFFFFF"/>
+          <w:sz w:val="14"/>
+          <w:szCs w:val="14"/>
         </w:rPr>
         <w:t>Bachiller en Desarrollo Fullstack</w:t>
       </w:r>
@@ -596,14 +964,14 @@
     <w:p>
       <w:pPr>
         <w:shd w:val="clear" w:color="auto" w:fill="0F172A"/>
-        <w:divId w:val="2061707314"/>
+        <w:divId w:val="1498500077"/>
         <w:rPr>
           <w:rFonts w:ascii="Segoe UI" w:eastAsia="Times New Roman" w:hAnsi="Segoe UI" w:cs="Segoe UI"/>
           <w:b/>
           <w:bCs/>
           <w:color w:val="38BDF8"/>
-          <w:sz w:val="14"/>
-          <w:szCs w:val="14"/>
+          <w:sz w:val="13"/>
+          <w:szCs w:val="13"/>
         </w:rPr>
       </w:pPr>
       <w:r>
@@ -612,8 +980,8 @@
           <w:b/>
           <w:bCs/>
           <w:color w:val="38BDF8"/>
-          <w:sz w:val="14"/>
-          <w:szCs w:val="14"/>
+          <w:sz w:val="13"/>
+          <w:szCs w:val="13"/>
         </w:rPr>
         <w:t>IDAT - Instituto Superior</w:t>
       </w:r>
@@ -621,7 +989,7 @@
     <w:p>
       <w:pPr>
         <w:shd w:val="clear" w:color="auto" w:fill="0F172A"/>
-        <w:divId w:val="744297826"/>
+        <w:divId w:val="1673072263"/>
         <w:rPr>
           <w:rFonts w:ascii="Segoe UI" w:eastAsia="Times New Roman" w:hAnsi="Segoe UI" w:cs="Segoe UI"/>
           <w:color w:val="94A3B8"/>
@@ -642,7 +1010,7 @@
     <w:p>
       <w:pPr>
         <w:shd w:val="clear" w:color="auto" w:fill="0F172A"/>
-        <w:divId w:val="1302691129"/>
+        <w:divId w:val="1791557980"/>
         <w:rPr>
           <w:rFonts w:ascii="Segoe UI" w:eastAsia="Times New Roman" w:hAnsi="Segoe UI" w:cs="Segoe UI"/>
           <w:color w:val="CBD5E1"/>
@@ -663,14 +1031,14 @@
     <w:p>
       <w:pPr>
         <w:shd w:val="clear" w:color="auto" w:fill="0F172A"/>
-        <w:divId w:val="2039506219"/>
+        <w:divId w:val="2081754990"/>
         <w:rPr>
           <w:rFonts w:ascii="Segoe UI" w:eastAsia="Times New Roman" w:hAnsi="Segoe UI" w:cs="Segoe UI"/>
           <w:b/>
           <w:bCs/>
           <w:color w:val="FFFFFF"/>
-          <w:sz w:val="15"/>
-          <w:szCs w:val="15"/>
+          <w:sz w:val="14"/>
+          <w:szCs w:val="14"/>
         </w:rPr>
       </w:pPr>
       <w:r>
@@ -679,8 +1047,8 @@
           <w:b/>
           <w:bCs/>
           <w:color w:val="FFFFFF"/>
-          <w:sz w:val="15"/>
-          <w:szCs w:val="15"/>
+          <w:sz w:val="14"/>
+          <w:szCs w:val="14"/>
         </w:rPr>
         <w:t>Bootcamp Fullstack Java &amp; Angular</w:t>
       </w:r>
@@ -688,14 +1056,14 @@
     <w:p>
       <w:pPr>
         <w:shd w:val="clear" w:color="auto" w:fill="0F172A"/>
-        <w:divId w:val="1357660605"/>
+        <w:divId w:val="2118676867"/>
         <w:rPr>
           <w:rFonts w:ascii="Segoe UI" w:eastAsia="Times New Roman" w:hAnsi="Segoe UI" w:cs="Segoe UI"/>
           <w:b/>
           <w:bCs/>
           <w:color w:val="38BDF8"/>
-          <w:sz w:val="14"/>
-          <w:szCs w:val="14"/>
+          <w:sz w:val="13"/>
+          <w:szCs w:val="13"/>
         </w:rPr>
       </w:pPr>
       <w:r>
@@ -704,8 +1072,8 @@
           <w:b/>
           <w:bCs/>
           <w:color w:val="38BDF8"/>
-          <w:sz w:val="14"/>
-          <w:szCs w:val="14"/>
+          <w:sz w:val="13"/>
+          <w:szCs w:val="13"/>
         </w:rPr>
         <w:t>TECSUP - CÓDIGO (2024 - 2025)</w:t>
       </w:r>
@@ -713,7 +1081,7 @@
     <w:p>
       <w:pPr>
         <w:shd w:val="clear" w:color="auto" w:fill="0F172A"/>
-        <w:divId w:val="80303142"/>
+        <w:divId w:val="1630361655"/>
         <w:rPr>
           <w:rFonts w:ascii="Segoe UI" w:eastAsia="Times New Roman" w:hAnsi="Segoe UI" w:cs="Segoe UI"/>
           <w:color w:val="CBD5E1"/>
@@ -734,14 +1102,14 @@
     <w:p>
       <w:pPr>
         <w:shd w:val="clear" w:color="auto" w:fill="0F172A"/>
-        <w:divId w:val="1639141108"/>
+        <w:divId w:val="1808164588"/>
         <w:rPr>
           <w:rFonts w:ascii="Segoe UI" w:eastAsia="Times New Roman" w:hAnsi="Segoe UI" w:cs="Segoe UI"/>
           <w:b/>
           <w:bCs/>
           <w:color w:val="FFFFFF"/>
-          <w:sz w:val="15"/>
-          <w:szCs w:val="15"/>
+          <w:sz w:val="14"/>
+          <w:szCs w:val="14"/>
         </w:rPr>
       </w:pPr>
       <w:r>
@@ -750,23 +1118,23 @@
           <w:b/>
           <w:bCs/>
           <w:color w:val="FFFFFF"/>
-          <w:sz w:val="15"/>
-          <w:szCs w:val="15"/>
-        </w:rPr>
-        <w:t>Desarrollo Backend Node.js &amp; AWS Cloud</w:t>
+          <w:sz w:val="14"/>
+          <w:szCs w:val="14"/>
+        </w:rPr>
+        <w:t>Desarrollo Backend Node.js &amp; AWS</w:t>
       </w:r>
     </w:p>
     <w:p>
       <w:pPr>
         <w:shd w:val="clear" w:color="auto" w:fill="0F172A"/>
-        <w:divId w:val="305282620"/>
+        <w:divId w:val="267860279"/>
         <w:rPr>
           <w:rFonts w:ascii="Segoe UI" w:eastAsia="Times New Roman" w:hAnsi="Segoe UI" w:cs="Segoe UI"/>
           <w:b/>
           <w:bCs/>
           <w:color w:val="38BDF8"/>
-          <w:sz w:val="14"/>
-          <w:szCs w:val="14"/>
+          <w:sz w:val="13"/>
+          <w:szCs w:val="13"/>
         </w:rPr>
       </w:pPr>
       <w:r>
@@ -775,8 +1143,8 @@
           <w:b/>
           <w:bCs/>
           <w:color w:val="38BDF8"/>
-          <w:sz w:val="14"/>
-          <w:szCs w:val="14"/>
+          <w:sz w:val="13"/>
+          <w:szCs w:val="13"/>
         </w:rPr>
         <w:t>Cursos y Capacitación Virtual</w:t>
       </w:r>
@@ -784,7 +1152,7 @@
     <w:p>
       <w:pPr>
         <w:shd w:val="clear" w:color="auto" w:fill="0F172A"/>
-        <w:divId w:val="238908149"/>
+        <w:divId w:val="74327980"/>
         <w:rPr>
           <w:rFonts w:ascii="Segoe UI" w:eastAsia="Times New Roman" w:hAnsi="Segoe UI" w:cs="Segoe UI"/>
           <w:color w:val="CBD5E1"/>
@@ -799,20 +1167,20 @@
           <w:sz w:val="13"/>
           <w:szCs w:val="13"/>
         </w:rPr>
-        <w:t>Node.js (Express), AWS (Lambda, S3, CloudWatch), incidentes y trazas.</w:t>
+        <w:t>Express.js, AWS (Lambda, S3, CloudWatch), incidentes y trazas.</w:t>
       </w:r>
     </w:p>
     <w:p>
       <w:pPr>
         <w:shd w:val="clear" w:color="auto" w:fill="0F172A"/>
-        <w:divId w:val="1436438850"/>
+        <w:divId w:val="1559592848"/>
         <w:rPr>
           <w:rFonts w:ascii="Segoe UI" w:eastAsia="Times New Roman" w:hAnsi="Segoe UI" w:cs="Segoe UI"/>
           <w:b/>
           <w:bCs/>
           <w:color w:val="FFFFFF"/>
-          <w:sz w:val="15"/>
-          <w:szCs w:val="15"/>
+          <w:sz w:val="14"/>
+          <w:szCs w:val="14"/>
         </w:rPr>
       </w:pPr>
       <w:r>
@@ -821,8 +1189,8 @@
           <w:b/>
           <w:bCs/>
           <w:color w:val="FFFFFF"/>
-          <w:sz w:val="15"/>
-          <w:szCs w:val="15"/>
+          <w:sz w:val="14"/>
+          <w:szCs w:val="14"/>
         </w:rPr>
         <w:t>Certificaciones Nube (AWS &amp; Azure)</w:t>
       </w:r>
@@ -830,14 +1198,14 @@
     <w:p>
       <w:pPr>
         <w:shd w:val="clear" w:color="auto" w:fill="0F172A"/>
-        <w:divId w:val="1663970350"/>
+        <w:divId w:val="1772431846"/>
         <w:rPr>
           <w:rFonts w:ascii="Segoe UI" w:eastAsia="Times New Roman" w:hAnsi="Segoe UI" w:cs="Segoe UI"/>
           <w:b/>
           <w:bCs/>
           <w:color w:val="38BDF8"/>
-          <w:sz w:val="14"/>
-          <w:szCs w:val="14"/>
+          <w:sz w:val="13"/>
+          <w:szCs w:val="13"/>
         </w:rPr>
       </w:pPr>
       <w:r>
@@ -846,8 +1214,8 @@
           <w:b/>
           <w:bCs/>
           <w:color w:val="38BDF8"/>
-          <w:sz w:val="14"/>
-          <w:szCs w:val="14"/>
+          <w:sz w:val="13"/>
+          <w:szCs w:val="13"/>
         </w:rPr>
         <w:t>Capacitación Virtual</w:t>
       </w:r>
@@ -855,7 +1223,7 @@
     <w:p>
       <w:pPr>
         <w:shd w:val="clear" w:color="auto" w:fill="0F172A"/>
-        <w:divId w:val="1511066904"/>
+        <w:divId w:val="220219324"/>
         <w:rPr>
           <w:rFonts w:ascii="Segoe UI" w:eastAsia="Times New Roman" w:hAnsi="Segoe UI" w:cs="Segoe UI"/>
           <w:b/>
@@ -884,7 +1252,7 @@
     <w:p>
       <w:pPr>
         <w:shd w:val="clear" w:color="auto" w:fill="0F172A"/>
-        <w:divId w:val="1743287095"/>
+        <w:divId w:val="534780683"/>
         <w:rPr>
           <w:rFonts w:ascii="Segoe UI" w:eastAsia="Times New Roman" w:hAnsi="Segoe UI" w:cs="Segoe UI"/>
           <w:color w:val="CBD5E1"/>
@@ -900,10 +1268,10 @@
           <w:caps/>
           <w:color w:val="FFFFFF"/>
           <w:spacing w:val="5"/>
-          <w:sz w:val="14"/>
-          <w:szCs w:val="14"/>
-        </w:rPr>
-        <w:t>Licencia Conducir</w:t>
+          <w:sz w:val="13"/>
+          <w:szCs w:val="13"/>
+        </w:rPr>
+        <w:t>Licencia de Conducir</w:t>
       </w:r>
       <w:r>
         <w:rPr>
@@ -918,7 +1286,7 @@
     <w:p>
       <w:pPr>
         <w:shd w:val="clear" w:color="auto" w:fill="0F172A"/>
-        <w:divId w:val="706412931"/>
+        <w:divId w:val="297686796"/>
         <w:rPr>
           <w:rFonts w:ascii="Segoe UI" w:eastAsia="Times New Roman" w:hAnsi="Segoe UI" w:cs="Segoe UI"/>
           <w:color w:val="CBD5E1"/>
@@ -934,8 +1302,8 @@
           <w:caps/>
           <w:color w:val="FFFFFF"/>
           <w:spacing w:val="5"/>
-          <w:sz w:val="14"/>
-          <w:szCs w:val="14"/>
+          <w:sz w:val="13"/>
+          <w:szCs w:val="13"/>
         </w:rPr>
         <w:t>Idiomas</w:t>
       </w:r>
@@ -953,7 +1321,7 @@
       <w:pPr>
         <w:pStyle w:val="Ttulo1"/>
         <w:shd w:val="clear" w:color="auto" w:fill="FFFFFF"/>
-        <w:divId w:val="739600404"/>
+        <w:divId w:val="540821454"/>
         <w:rPr>
           <w:rFonts w:ascii="Segoe UI" w:eastAsia="Times New Roman" w:hAnsi="Segoe UI" w:cs="Segoe UI"/>
           <w:color w:val="0F172A"/>
@@ -976,7 +1344,7 @@
     <w:p>
       <w:pPr>
         <w:shd w:val="clear" w:color="auto" w:fill="FFFFFF"/>
-        <w:divId w:val="1657100416"/>
+        <w:divId w:val="1935240515"/>
         <w:rPr>
           <w:rFonts w:ascii="Segoe UI" w:eastAsia="Times New Roman" w:hAnsi="Segoe UI" w:cs="Segoe UI"/>
           <w:b/>
@@ -1005,7 +1373,7 @@
     <w:p>
       <w:pPr>
         <w:shd w:val="clear" w:color="auto" w:fill="FFFFFF"/>
-        <w:divId w:val="918708966"/>
+        <w:divId w:val="1397781449"/>
         <w:rPr>
           <w:rFonts w:ascii="Segoe UI" w:eastAsia="Times New Roman" w:hAnsi="Segoe UI" w:cs="Segoe UI"/>
           <w:b/>
@@ -1030,7 +1398,7 @@
     <w:p>
       <w:pPr>
         <w:shd w:val="clear" w:color="auto" w:fill="FFFFFF"/>
-        <w:divId w:val="1774087346"/>
+        <w:divId w:val="1203900767"/>
         <w:rPr>
           <w:rFonts w:ascii="Segoe UI" w:eastAsia="Times New Roman" w:hAnsi="Segoe UI" w:cs="Segoe UI"/>
           <w:b/>
@@ -1060,7 +1428,7 @@
       <w:pPr>
         <w:pStyle w:val="profile-summary"/>
         <w:shd w:val="clear" w:color="auto" w:fill="FFFFFF"/>
-        <w:divId w:val="173812073"/>
+        <w:divId w:val="1910925164"/>
         <w:rPr>
           <w:rFonts w:ascii="Segoe UI" w:hAnsi="Segoe UI" w:cs="Segoe UI"/>
         </w:rPr>
@@ -1069,7 +1437,7 @@
         <w:rPr>
           <w:rFonts w:ascii="Segoe UI" w:hAnsi="Segoe UI" w:cs="Segoe UI"/>
         </w:rPr>
-        <w:t xml:space="preserve">Desarrollador Fullstack especializado en </w:t>
+        <w:t xml:space="preserve">Desarrollador de Software Fullstack con amplia experiencia en la construcción de soluciones empresariales utilizando </w:t>
       </w:r>
       <w:r>
         <w:rPr>
@@ -1129,7 +1497,7 @@
         <w:rPr>
           <w:rFonts w:ascii="Segoe UI" w:hAnsi="Segoe UI" w:cs="Segoe UI"/>
         </w:rPr>
-        <w:t xml:space="preserve">. Capacidad comprobada para </w:t>
+        <w:t xml:space="preserve">. Capacidad demostrada para </w:t>
       </w:r>
       <w:r>
         <w:rPr>
@@ -1138,7 +1506,7 @@
           <w:bCs/>
           <w:color w:val="0369A1"/>
         </w:rPr>
-        <w:t>gestionar incidentes productivos, analizar trazas de errores (logs/CloudWatch) e implementar remediaciones inmediatas de código</w:t>
+        <w:t>gestionar incidentes productivos, analizar trazas de registros (stack traces / CloudWatch) y proponer remediaciones efectivas de código</w:t>
       </w:r>
       <w:r>
         <w:rPr>
@@ -1153,13 +1521,13 @@
           <w:bCs/>
           <w:color w:val="0369A1"/>
         </w:rPr>
-        <w:t>ERP ICO Logística</w:t>
+        <w:t>ERP para ICO Logística</w:t>
       </w:r>
       <w:r>
         <w:rPr>
           <w:rFonts w:ascii="Segoe UI" w:hAnsi="Segoe UI" w:cs="Segoe UI"/>
         </w:rPr>
-        <w:t xml:space="preserve">, CRM Comercial, submódulo de </w:t>
+        <w:t xml:space="preserve">, CRM de ventas, submódulo de </w:t>
       </w:r>
       <w:r>
         <w:rPr>
@@ -1168,13 +1536,13 @@
           <w:bCs/>
           <w:color w:val="0369A1"/>
         </w:rPr>
-        <w:t>Gestión de Activos TI</w:t>
+        <w:t>Gestión de Activos de TI</w:t>
       </w:r>
       <w:r>
         <w:rPr>
           <w:rFonts w:ascii="Segoe UI" w:hAnsi="Segoe UI" w:cs="Segoe UI"/>
         </w:rPr>
-        <w:t xml:space="preserve"> y servicios Cloud </w:t>
+        <w:t xml:space="preserve"> y servicios Cloud con </w:t>
       </w:r>
       <w:r>
         <w:rPr>
@@ -1189,7 +1557,7 @@
         <w:rPr>
           <w:rFonts w:ascii="Segoe UI" w:hAnsi="Segoe UI" w:cs="Segoe UI"/>
         </w:rPr>
-        <w:t xml:space="preserve"> sobre </w:t>
+        <w:t xml:space="preserve"> sobre bases de datos </w:t>
       </w:r>
       <w:r>
         <w:rPr>
@@ -1225,7 +1593,7 @@
     <w:p>
       <w:pPr>
         <w:shd w:val="clear" w:color="auto" w:fill="FFFFFF"/>
-        <w:divId w:val="928346325"/>
+        <w:divId w:val="1255893550"/>
         <w:rPr>
           <w:rFonts w:ascii="Segoe UI" w:eastAsia="Times New Roman" w:hAnsi="Segoe UI" w:cs="Segoe UI"/>
           <w:b/>
@@ -1248,13 +1616,13 @@
           <w:sz w:val="16"/>
           <w:szCs w:val="16"/>
         </w:rPr>
-        <w:t>Experiencia Laboral</w:t>
+        <w:t>Experiencia Laboral Principal</w:t>
       </w:r>
     </w:p>
     <w:p>
       <w:pPr>
         <w:shd w:val="clear" w:color="auto" w:fill="FFFFFF"/>
-        <w:divId w:val="917445913"/>
+        <w:divId w:val="303894010"/>
         <w:rPr>
           <w:rFonts w:ascii="Segoe UI" w:eastAsia="Times New Roman" w:hAnsi="Segoe UI" w:cs="Segoe UI"/>
           <w:color w:val="1E293B"/>
@@ -1298,7 +1666,7 @@
     <w:p>
       <w:pPr>
         <w:shd w:val="clear" w:color="auto" w:fill="FFFFFF"/>
-        <w:divId w:val="1751848753"/>
+        <w:divId w:val="1004481086"/>
         <w:rPr>
           <w:rFonts w:ascii="Segoe UI" w:eastAsia="Times New Roman" w:hAnsi="Segoe UI" w:cs="Segoe UI"/>
           <w:color w:val="1E293B"/>
@@ -1312,337 +1680,6 @@
           <w:rFonts w:ascii="Segoe UI" w:eastAsia="Times New Roman" w:hAnsi="Segoe UI" w:cs="Segoe UI"/>
         </w:rPr>
         <w:t>Feb 2025 – Presente</w:t>
-      </w:r>
-      <w:r>
-        <w:rPr>
-          <w:rFonts w:ascii="Segoe UI" w:eastAsia="Times New Roman" w:hAnsi="Segoe UI" w:cs="Segoe UI"/>
-          <w:color w:val="1E293B"/>
-          <w:sz w:val="15"/>
-          <w:szCs w:val="15"/>
-        </w:rPr>
-        <w:t xml:space="preserve"> </w:t>
-      </w:r>
-    </w:p>
-    <w:p>
-      <w:pPr>
-        <w:numPr>
-          <w:ilvl w:val="0"/>
-          <w:numId w:val="1"/>
-        </w:numPr>
-        <w:shd w:val="clear" w:color="auto" w:fill="FFFFFF"/>
-        <w:spacing w:before="100" w:beforeAutospacing="1" w:after="15"/>
-        <w:ind w:left="870"/>
-        <w:divId w:val="1470201495"/>
-        <w:rPr>
-          <w:rFonts w:ascii="Segoe UI" w:eastAsia="Times New Roman" w:hAnsi="Segoe UI" w:cs="Segoe UI"/>
-          <w:color w:val="334155"/>
-          <w:sz w:val="14"/>
-          <w:szCs w:val="14"/>
-        </w:rPr>
-      </w:pPr>
-      <w:r>
-        <w:rPr>
-          <w:rFonts w:ascii="Segoe UI" w:eastAsia="Times New Roman" w:hAnsi="Segoe UI" w:cs="Segoe UI"/>
-          <w:b/>
-          <w:bCs/>
-          <w:color w:val="0F172A"/>
-          <w:sz w:val="14"/>
-          <w:szCs w:val="14"/>
-        </w:rPr>
-        <w:t>Gestión de Incidentes &amp; Trazabilidad:</w:t>
-      </w:r>
-      <w:r>
-        <w:rPr>
-          <w:rFonts w:ascii="Segoe UI" w:eastAsia="Times New Roman" w:hAnsi="Segoe UI" w:cs="Segoe UI"/>
-          <w:color w:val="334155"/>
-          <w:sz w:val="14"/>
-          <w:szCs w:val="14"/>
-        </w:rPr>
-        <w:t xml:space="preserve"> </w:t>
-      </w:r>
-      <w:r>
-        <w:rPr>
-          <w:rFonts w:ascii="Segoe UI" w:eastAsia="Times New Roman" w:hAnsi="Segoe UI" w:cs="Segoe UI"/>
-          <w:color w:val="334155"/>
-          <w:sz w:val="14"/>
-          <w:szCs w:val="14"/>
-        </w:rPr>
-        <w:t xml:space="preserve">Monitoreo continuo de servicios en producción, análisis de trazas de errores (logs/CloudWatch) y </w:t>
-      </w:r>
-      <w:r>
-        <w:rPr>
-          <w:rFonts w:ascii="Segoe UI" w:eastAsia="Times New Roman" w:hAnsi="Segoe UI" w:cs="Segoe UI"/>
-          <w:b/>
-          <w:bCs/>
-          <w:color w:val="0F172A"/>
-          <w:sz w:val="14"/>
-          <w:szCs w:val="14"/>
-        </w:rPr>
-        <w:t>remediación directa de código</w:t>
-      </w:r>
-      <w:r>
-        <w:rPr>
-          <w:rFonts w:ascii="Segoe UI" w:eastAsia="Times New Roman" w:hAnsi="Segoe UI" w:cs="Segoe UI"/>
-          <w:color w:val="334155"/>
-          <w:sz w:val="14"/>
-          <w:szCs w:val="14"/>
-        </w:rPr>
-        <w:t xml:space="preserve"> en Java 21 / Spring Boot y Node.js.</w:t>
-      </w:r>
-    </w:p>
-    <w:p>
-      <w:pPr>
-        <w:numPr>
-          <w:ilvl w:val="0"/>
-          <w:numId w:val="1"/>
-        </w:numPr>
-        <w:shd w:val="clear" w:color="auto" w:fill="FFFFFF"/>
-        <w:spacing w:before="100" w:beforeAutospacing="1" w:after="15"/>
-        <w:ind w:left="870"/>
-        <w:divId w:val="1470201495"/>
-        <w:rPr>
-          <w:rFonts w:ascii="Segoe UI" w:eastAsia="Times New Roman" w:hAnsi="Segoe UI" w:cs="Segoe UI"/>
-          <w:color w:val="334155"/>
-          <w:sz w:val="14"/>
-          <w:szCs w:val="14"/>
-        </w:rPr>
-      </w:pPr>
-      <w:r>
-        <w:rPr>
-          <w:rFonts w:ascii="Segoe UI" w:eastAsia="Times New Roman" w:hAnsi="Segoe UI" w:cs="Segoe UI"/>
-          <w:b/>
-          <w:bCs/>
-          <w:color w:val="0F172A"/>
-          <w:sz w:val="14"/>
-          <w:szCs w:val="14"/>
-        </w:rPr>
-        <w:t>Sistema ERP ICO Logística (Java 21, Node.js &amp; Angular):</w:t>
-      </w:r>
-      <w:r>
-        <w:rPr>
-          <w:rFonts w:ascii="Segoe UI" w:eastAsia="Times New Roman" w:hAnsi="Segoe UI" w:cs="Segoe UI"/>
-          <w:color w:val="334155"/>
-          <w:sz w:val="14"/>
-          <w:szCs w:val="14"/>
-        </w:rPr>
-        <w:t xml:space="preserve"> Desarrollo integral del ERP, APIs RESTful, Spring Security JWT, PDFs dinámicos e integración con </w:t>
-      </w:r>
-      <w:r>
-        <w:rPr>
-          <w:rFonts w:ascii="Segoe UI" w:eastAsia="Times New Roman" w:hAnsi="Segoe UI" w:cs="Segoe UI"/>
-          <w:b/>
-          <w:bCs/>
-          <w:color w:val="0F172A"/>
-          <w:sz w:val="14"/>
-          <w:szCs w:val="14"/>
-        </w:rPr>
-        <w:t>AWS S3</w:t>
-      </w:r>
-      <w:r>
-        <w:rPr>
-          <w:rFonts w:ascii="Segoe UI" w:eastAsia="Times New Roman" w:hAnsi="Segoe UI" w:cs="Segoe UI"/>
-          <w:color w:val="334155"/>
-          <w:sz w:val="14"/>
-          <w:szCs w:val="14"/>
-        </w:rPr>
-        <w:t>.</w:t>
-      </w:r>
-    </w:p>
-    <w:p>
-      <w:pPr>
-        <w:numPr>
-          <w:ilvl w:val="0"/>
-          <w:numId w:val="1"/>
-        </w:numPr>
-        <w:shd w:val="clear" w:color="auto" w:fill="FFFFFF"/>
-        <w:spacing w:before="100" w:beforeAutospacing="1" w:after="15"/>
-        <w:ind w:left="870"/>
-        <w:divId w:val="1470201495"/>
-        <w:rPr>
-          <w:rFonts w:ascii="Segoe UI" w:eastAsia="Times New Roman" w:hAnsi="Segoe UI" w:cs="Segoe UI"/>
-          <w:color w:val="334155"/>
-          <w:sz w:val="14"/>
-          <w:szCs w:val="14"/>
-        </w:rPr>
-      </w:pPr>
-      <w:r>
-        <w:rPr>
-          <w:rFonts w:ascii="Segoe UI" w:eastAsia="Times New Roman" w:hAnsi="Segoe UI" w:cs="Segoe UI"/>
-          <w:b/>
-          <w:bCs/>
-          <w:color w:val="0F172A"/>
-          <w:sz w:val="14"/>
-          <w:szCs w:val="14"/>
-        </w:rPr>
-        <w:t>Submódulo Sistemas TI &amp; Activos:</w:t>
-      </w:r>
-      <w:r>
-        <w:rPr>
-          <w:rFonts w:ascii="Segoe UI" w:eastAsia="Times New Roman" w:hAnsi="Segoe UI" w:cs="Segoe UI"/>
-          <w:color w:val="334155"/>
-          <w:sz w:val="14"/>
-          <w:szCs w:val="14"/>
-        </w:rPr>
-        <w:t xml:space="preserve"> Control relacional de equipos de TI, generador de códigos (`ICO-LAP-`) y actas firmadas en PDF.</w:t>
-      </w:r>
-    </w:p>
-    <w:p>
-      <w:pPr>
-        <w:numPr>
-          <w:ilvl w:val="0"/>
-          <w:numId w:val="1"/>
-        </w:numPr>
-        <w:shd w:val="clear" w:color="auto" w:fill="FFFFFF"/>
-        <w:spacing w:before="100" w:beforeAutospacing="1" w:after="15"/>
-        <w:ind w:left="870"/>
-        <w:divId w:val="1470201495"/>
-        <w:rPr>
-          <w:rFonts w:ascii="Segoe UI" w:eastAsia="Times New Roman" w:hAnsi="Segoe UI" w:cs="Segoe UI"/>
-          <w:color w:val="334155"/>
-          <w:sz w:val="14"/>
-          <w:szCs w:val="14"/>
-        </w:rPr>
-      </w:pPr>
-      <w:r>
-        <w:rPr>
-          <w:rFonts w:ascii="Segoe UI" w:eastAsia="Times New Roman" w:hAnsi="Segoe UI" w:cs="Segoe UI"/>
-          <w:b/>
-          <w:bCs/>
-          <w:color w:val="0F172A"/>
-          <w:sz w:val="14"/>
-          <w:szCs w:val="14"/>
-        </w:rPr>
-        <w:t>CRM Comercial &amp; App Móvil:</w:t>
-      </w:r>
-      <w:r>
-        <w:rPr>
-          <w:rFonts w:ascii="Segoe UI" w:eastAsia="Times New Roman" w:hAnsi="Segoe UI" w:cs="Segoe UI"/>
-          <w:color w:val="334155"/>
-          <w:sz w:val="14"/>
-          <w:szCs w:val="14"/>
-        </w:rPr>
-        <w:t xml:space="preserve"> CRM Web en Angular/Node.js e integración con app móvil nativa en </w:t>
-      </w:r>
-      <w:r>
-        <w:rPr>
-          <w:rFonts w:ascii="Segoe UI" w:eastAsia="Times New Roman" w:hAnsi="Segoe UI" w:cs="Segoe UI"/>
-          <w:b/>
-          <w:bCs/>
-          <w:color w:val="0F172A"/>
-          <w:sz w:val="14"/>
-          <w:szCs w:val="14"/>
-        </w:rPr>
-        <w:t>Kotlin</w:t>
-      </w:r>
-      <w:r>
-        <w:rPr>
-          <w:rFonts w:ascii="Segoe UI" w:eastAsia="Times New Roman" w:hAnsi="Segoe UI" w:cs="Segoe UI"/>
-          <w:color w:val="334155"/>
-          <w:sz w:val="14"/>
-          <w:szCs w:val="14"/>
-        </w:rPr>
-        <w:t>.</w:t>
-      </w:r>
-    </w:p>
-    <w:p>
-      <w:pPr>
-        <w:numPr>
-          <w:ilvl w:val="0"/>
-          <w:numId w:val="1"/>
-        </w:numPr>
-        <w:shd w:val="clear" w:color="auto" w:fill="FFFFFF"/>
-        <w:spacing w:before="100" w:beforeAutospacing="1" w:after="15"/>
-        <w:ind w:left="870"/>
-        <w:divId w:val="1470201495"/>
-        <w:rPr>
-          <w:rFonts w:ascii="Segoe UI" w:eastAsia="Times New Roman" w:hAnsi="Segoe UI" w:cs="Segoe UI"/>
-          <w:color w:val="334155"/>
-          <w:sz w:val="14"/>
-          <w:szCs w:val="14"/>
-        </w:rPr>
-      </w:pPr>
-      <w:r>
-        <w:rPr>
-          <w:rFonts w:ascii="Segoe UI" w:eastAsia="Times New Roman" w:hAnsi="Segoe UI" w:cs="Segoe UI"/>
-          <w:b/>
-          <w:bCs/>
-          <w:color w:val="0F172A"/>
-          <w:sz w:val="14"/>
-          <w:szCs w:val="14"/>
-        </w:rPr>
-        <w:t>Control de Asistencia RRHH &amp; Soporte:</w:t>
-      </w:r>
-      <w:r>
-        <w:rPr>
-          <w:rFonts w:ascii="Segoe UI" w:eastAsia="Times New Roman" w:hAnsi="Segoe UI" w:cs="Segoe UI"/>
-          <w:color w:val="334155"/>
-          <w:sz w:val="14"/>
-          <w:szCs w:val="14"/>
-        </w:rPr>
-        <w:t xml:space="preserve"> Web Angular + backend RESTful, app móvil .NET MAUI y soporte Active Directory / SAP.</w:t>
-      </w:r>
-    </w:p>
-    <w:p>
-      <w:pPr>
-        <w:shd w:val="clear" w:color="auto" w:fill="FFFFFF"/>
-        <w:divId w:val="46532715"/>
-        <w:rPr>
-          <w:rFonts w:ascii="Segoe UI" w:eastAsia="Times New Roman" w:hAnsi="Segoe UI" w:cs="Segoe UI"/>
-          <w:color w:val="1E293B"/>
-          <w:sz w:val="15"/>
-          <w:szCs w:val="15"/>
-        </w:rPr>
-      </w:pPr>
-      <w:r>
-        <w:rPr>
-          <w:rStyle w:val="job-role1"/>
-          <w:rFonts w:ascii="Segoe UI" w:eastAsia="Times New Roman" w:hAnsi="Segoe UI" w:cs="Segoe UI"/>
-        </w:rPr>
-        <w:t>Asesor CSR1 y ATC Netflix</w:t>
-      </w:r>
-      <w:r>
-        <w:rPr>
-          <w:rFonts w:ascii="Segoe UI" w:eastAsia="Times New Roman" w:hAnsi="Segoe UI" w:cs="Segoe UI"/>
-          <w:color w:val="1E293B"/>
-          <w:sz w:val="15"/>
-          <w:szCs w:val="15"/>
-        </w:rPr>
-        <w:t xml:space="preserve"> – </w:t>
-      </w:r>
-      <w:r>
-        <w:rPr>
-          <w:rStyle w:val="job-company1"/>
-          <w:rFonts w:ascii="Segoe UI" w:eastAsia="Times New Roman" w:hAnsi="Segoe UI" w:cs="Segoe UI"/>
-        </w:rPr>
-        <w:t>Teleperformance</w:t>
-      </w:r>
-      <w:r>
-        <w:rPr>
-          <w:rFonts w:ascii="Segoe UI" w:eastAsia="Times New Roman" w:hAnsi="Segoe UI" w:cs="Segoe UI"/>
-          <w:color w:val="1E293B"/>
-          <w:sz w:val="15"/>
-          <w:szCs w:val="15"/>
-        </w:rPr>
-        <w:t xml:space="preserve"> </w:t>
-      </w:r>
-    </w:p>
-    <w:p>
-      <w:pPr>
-        <w:shd w:val="clear" w:color="auto" w:fill="FFFFFF"/>
-        <w:divId w:val="188641776"/>
-        <w:rPr>
-          <w:rFonts w:ascii="Segoe UI" w:eastAsia="Times New Roman" w:hAnsi="Segoe UI" w:cs="Segoe UI"/>
-          <w:color w:val="1E293B"/>
-          <w:sz w:val="15"/>
-          <w:szCs w:val="15"/>
-        </w:rPr>
-      </w:pPr>
-      <w:r>
-        <w:rPr>
-          <w:rStyle w:val="job-period1"/>
-          <w:rFonts w:ascii="Segoe UI" w:eastAsia="Times New Roman" w:hAnsi="Segoe UI" w:cs="Segoe UI"/>
-        </w:rPr>
-        <w:t>Oct 2022 – Ene 2025</w:t>
       </w:r>
       <w:r>
         <w:rPr>
@@ -1663,7 +1700,7 @@
         <w:shd w:val="clear" w:color="auto" w:fill="FFFFFF"/>
         <w:spacing w:before="100" w:beforeAutospacing="1" w:after="15"/>
         <w:ind w:left="870"/>
-        <w:divId w:val="625501545"/>
+        <w:divId w:val="1823500948"/>
         <w:rPr>
           <w:rFonts w:ascii="Segoe UI" w:eastAsia="Times New Roman" w:hAnsi="Segoe UI" w:cs="Segoe UI"/>
           <w:color w:val="334155"/>
@@ -1674,17 +1711,310 @@
       <w:r>
         <w:rPr>
           <w:rFonts w:ascii="Segoe UI" w:eastAsia="Times New Roman" w:hAnsi="Segoe UI" w:cs="Segoe UI"/>
+          <w:b/>
+          <w:bCs/>
+          <w:color w:val="0F172A"/>
+          <w:sz w:val="14"/>
+          <w:szCs w:val="14"/>
+        </w:rPr>
+        <w:lastRenderedPageBreak/>
+        <w:t>Gestión de Incidentes &amp; Trazabilidad Backend:</w:t>
+      </w:r>
+      <w:r>
+        <w:rPr>
+          <w:rFonts w:ascii="Segoe UI" w:eastAsia="Times New Roman" w:hAnsi="Segoe UI" w:cs="Segoe UI"/>
           <w:color w:val="334155"/>
           <w:sz w:val="14"/>
           <w:szCs w:val="14"/>
         </w:rPr>
-        <w:t>Resolución de incidencias técnicas en la plataforma Netflix. Soporte a cuentas corporativas y usuarios finales.</w:t>
-      </w:r>
-    </w:p>
-    <w:p>
-      <w:pPr>
+        <w:t xml:space="preserve"> Monitoreo continuo de servicios en producción, diagnóstico y </w:t>
+      </w:r>
+      <w:r>
+        <w:rPr>
+          <w:rFonts w:ascii="Segoe UI" w:eastAsia="Times New Roman" w:hAnsi="Segoe UI" w:cs="Segoe UI"/>
+          <w:b/>
+          <w:bCs/>
+          <w:color w:val="0F172A"/>
+          <w:sz w:val="14"/>
+          <w:szCs w:val="14"/>
+        </w:rPr>
+        <w:t>análisis de trazas de errores (logs / stack traces)</w:t>
+      </w:r>
+      <w:r>
+        <w:rPr>
+          <w:rFonts w:ascii="Segoe UI" w:eastAsia="Times New Roman" w:hAnsi="Segoe UI" w:cs="Segoe UI"/>
+          <w:color w:val="334155"/>
+          <w:sz w:val="14"/>
+          <w:szCs w:val="14"/>
+        </w:rPr>
+        <w:t xml:space="preserve"> para proponer e implementar </w:t>
+      </w:r>
+      <w:r>
+        <w:rPr>
+          <w:rFonts w:ascii="Segoe UI" w:eastAsia="Times New Roman" w:hAnsi="Segoe UI" w:cs="Segoe UI"/>
+          <w:b/>
+          <w:bCs/>
+          <w:color w:val="0F172A"/>
+          <w:sz w:val="14"/>
+          <w:szCs w:val="14"/>
+        </w:rPr>
+        <w:t>remediaciones inmediatas de código</w:t>
+      </w:r>
+      <w:r>
+        <w:rPr>
+          <w:rFonts w:ascii="Segoe UI" w:eastAsia="Times New Roman" w:hAnsi="Segoe UI" w:cs="Segoe UI"/>
+          <w:color w:val="334155"/>
+          <w:sz w:val="14"/>
+          <w:szCs w:val="14"/>
+        </w:rPr>
+        <w:t xml:space="preserve"> en microservicios backend con Java 21 / Spring Boot y Node.js.</w:t>
+      </w:r>
+    </w:p>
+    <w:p>
+      <w:pPr>
+        <w:numPr>
+          <w:ilvl w:val="0"/>
+          <w:numId w:val="2"/>
+        </w:numPr>
         <w:shd w:val="clear" w:color="auto" w:fill="FFFFFF"/>
-        <w:divId w:val="236944776"/>
+        <w:spacing w:before="100" w:beforeAutospacing="1" w:after="15"/>
+        <w:ind w:left="870"/>
+        <w:divId w:val="1823500948"/>
+        <w:rPr>
+          <w:rFonts w:ascii="Segoe UI" w:eastAsia="Times New Roman" w:hAnsi="Segoe UI" w:cs="Segoe UI"/>
+          <w:color w:val="334155"/>
+          <w:sz w:val="14"/>
+          <w:szCs w:val="14"/>
+        </w:rPr>
+      </w:pPr>
+      <w:r>
+        <w:rPr>
+          <w:rFonts w:ascii="Segoe UI" w:eastAsia="Times New Roman" w:hAnsi="Segoe UI" w:cs="Segoe UI"/>
+          <w:b/>
+          <w:bCs/>
+          <w:color w:val="0F172A"/>
+          <w:sz w:val="14"/>
+          <w:szCs w:val="14"/>
+        </w:rPr>
+        <w:t>Sistema ERP ICO Logística (Java 21, Node.js &amp; Angular):</w:t>
+      </w:r>
+      <w:r>
+        <w:rPr>
+          <w:rFonts w:ascii="Segoe UI" w:eastAsia="Times New Roman" w:hAnsi="Segoe UI" w:cs="Segoe UI"/>
+          <w:color w:val="334155"/>
+          <w:sz w:val="14"/>
+          <w:szCs w:val="14"/>
+        </w:rPr>
+        <w:t xml:space="preserve"> Liderazgo y desarrollo del ERP. Construcción de APIs RESTful, seguridad JWT, reportes dinámicos PDF e integración con servicios de almacenamiento en la nube </w:t>
+      </w:r>
+      <w:r>
+        <w:rPr>
+          <w:rFonts w:ascii="Segoe UI" w:eastAsia="Times New Roman" w:hAnsi="Segoe UI" w:cs="Segoe UI"/>
+          <w:b/>
+          <w:bCs/>
+          <w:color w:val="0F172A"/>
+          <w:sz w:val="14"/>
+          <w:szCs w:val="14"/>
+        </w:rPr>
+        <w:t>AWS S3</w:t>
+      </w:r>
+      <w:r>
+        <w:rPr>
+          <w:rFonts w:ascii="Segoe UI" w:eastAsia="Times New Roman" w:hAnsi="Segoe UI" w:cs="Segoe UI"/>
+          <w:color w:val="334155"/>
+          <w:sz w:val="14"/>
+          <w:szCs w:val="14"/>
+        </w:rPr>
+        <w:t>.</w:t>
+      </w:r>
+    </w:p>
+    <w:p>
+      <w:pPr>
+        <w:numPr>
+          <w:ilvl w:val="0"/>
+          <w:numId w:val="2"/>
+        </w:numPr>
+        <w:shd w:val="clear" w:color="auto" w:fill="FFFFFF"/>
+        <w:spacing w:before="100" w:beforeAutospacing="1" w:after="15"/>
+        <w:ind w:left="870"/>
+        <w:divId w:val="1823500948"/>
+        <w:rPr>
+          <w:rFonts w:ascii="Segoe UI" w:eastAsia="Times New Roman" w:hAnsi="Segoe UI" w:cs="Segoe UI"/>
+          <w:color w:val="334155"/>
+          <w:sz w:val="14"/>
+          <w:szCs w:val="14"/>
+        </w:rPr>
+      </w:pPr>
+      <w:r>
+        <w:rPr>
+          <w:rFonts w:ascii="Segoe UI" w:eastAsia="Times New Roman" w:hAnsi="Segoe UI" w:cs="Segoe UI"/>
+          <w:b/>
+          <w:bCs/>
+          <w:color w:val="0F172A"/>
+          <w:sz w:val="14"/>
+          <w:szCs w:val="14"/>
+        </w:rPr>
+        <w:t>Submódulo de Sistemas TI &amp; Control de Activos:</w:t>
+      </w:r>
+      <w:r>
+        <w:rPr>
+          <w:rFonts w:ascii="Segoe UI" w:eastAsia="Times New Roman" w:hAnsi="Segoe UI" w:cs="Segoe UI"/>
+          <w:color w:val="334155"/>
+          <w:sz w:val="14"/>
+          <w:szCs w:val="14"/>
+        </w:rPr>
+        <w:t xml:space="preserve"> Desarrollo del módulo relacional para gestión de equipos tecnológicos, autogenerador dinámico de códigos patrimoniales (`ICO-LAP-`, `ICO-CEL-`) y registro de actas firmadas en PDF.</w:t>
+      </w:r>
+    </w:p>
+    <w:p>
+      <w:pPr>
+        <w:numPr>
+          <w:ilvl w:val="0"/>
+          <w:numId w:val="2"/>
+        </w:numPr>
+        <w:shd w:val="clear" w:color="auto" w:fill="FFFFFF"/>
+        <w:spacing w:before="100" w:beforeAutospacing="1" w:after="15"/>
+        <w:ind w:left="870"/>
+        <w:divId w:val="1823500948"/>
+        <w:rPr>
+          <w:rFonts w:ascii="Segoe UI" w:eastAsia="Times New Roman" w:hAnsi="Segoe UI" w:cs="Segoe UI"/>
+          <w:color w:val="334155"/>
+          <w:sz w:val="14"/>
+          <w:szCs w:val="14"/>
+        </w:rPr>
+      </w:pPr>
+      <w:r>
+        <w:rPr>
+          <w:rFonts w:ascii="Segoe UI" w:eastAsia="Times New Roman" w:hAnsi="Segoe UI" w:cs="Segoe UI"/>
+          <w:b/>
+          <w:bCs/>
+          <w:color w:val="0F172A"/>
+          <w:sz w:val="14"/>
+          <w:szCs w:val="14"/>
+        </w:rPr>
+        <w:t>CRM Comercial &amp; App Móvil de Ventas:</w:t>
+      </w:r>
+      <w:r>
+        <w:rPr>
+          <w:rFonts w:ascii="Segoe UI" w:eastAsia="Times New Roman" w:hAnsi="Segoe UI" w:cs="Segoe UI"/>
+          <w:color w:val="334155"/>
+          <w:sz w:val="14"/>
+          <w:szCs w:val="14"/>
+        </w:rPr>
+        <w:t xml:space="preserve"> Sistema CRM Web en </w:t>
+      </w:r>
+      <w:r>
+        <w:rPr>
+          <w:rFonts w:ascii="Segoe UI" w:eastAsia="Times New Roman" w:hAnsi="Segoe UI" w:cs="Segoe UI"/>
+          <w:b/>
+          <w:bCs/>
+          <w:color w:val="0F172A"/>
+          <w:sz w:val="14"/>
+          <w:szCs w:val="14"/>
+        </w:rPr>
+        <w:t>Angular</w:t>
+      </w:r>
+      <w:r>
+        <w:rPr>
+          <w:rFonts w:ascii="Segoe UI" w:eastAsia="Times New Roman" w:hAnsi="Segoe UI" w:cs="Segoe UI"/>
+          <w:color w:val="334155"/>
+          <w:sz w:val="14"/>
+          <w:szCs w:val="14"/>
+        </w:rPr>
+        <w:t xml:space="preserve"> y </w:t>
+      </w:r>
+      <w:r>
+        <w:rPr>
+          <w:rFonts w:ascii="Segoe UI" w:eastAsia="Times New Roman" w:hAnsi="Segoe UI" w:cs="Segoe UI"/>
+          <w:b/>
+          <w:bCs/>
+          <w:color w:val="0F172A"/>
+          <w:sz w:val="14"/>
+          <w:szCs w:val="14"/>
+        </w:rPr>
+        <w:t>Node.js / Spring Boot</w:t>
+      </w:r>
+      <w:r>
+        <w:rPr>
+          <w:rFonts w:ascii="Segoe UI" w:eastAsia="Times New Roman" w:hAnsi="Segoe UI" w:cs="Segoe UI"/>
+          <w:color w:val="334155"/>
+          <w:sz w:val="14"/>
+          <w:szCs w:val="14"/>
+        </w:rPr>
+        <w:t xml:space="preserve"> integrado con aplicación móvil nativa en </w:t>
+      </w:r>
+      <w:r>
+        <w:rPr>
+          <w:rFonts w:ascii="Segoe UI" w:eastAsia="Times New Roman" w:hAnsi="Segoe UI" w:cs="Segoe UI"/>
+          <w:b/>
+          <w:bCs/>
+          <w:color w:val="0F172A"/>
+          <w:sz w:val="14"/>
+          <w:szCs w:val="14"/>
+        </w:rPr>
+        <w:t>Kotlin</w:t>
+      </w:r>
+      <w:r>
+        <w:rPr>
+          <w:rFonts w:ascii="Segoe UI" w:eastAsia="Times New Roman" w:hAnsi="Segoe UI" w:cs="Segoe UI"/>
+          <w:color w:val="334155"/>
+          <w:sz w:val="14"/>
+          <w:szCs w:val="14"/>
+        </w:rPr>
+        <w:t xml:space="preserve"> para la fuerza de ventas en campo.</w:t>
+      </w:r>
+    </w:p>
+    <w:p>
+      <w:pPr>
+        <w:numPr>
+          <w:ilvl w:val="0"/>
+          <w:numId w:val="2"/>
+        </w:numPr>
+        <w:shd w:val="clear" w:color="auto" w:fill="FFFFFF"/>
+        <w:spacing w:before="100" w:beforeAutospacing="1" w:after="15"/>
+        <w:ind w:left="870"/>
+        <w:divId w:val="1823500948"/>
+        <w:rPr>
+          <w:rFonts w:ascii="Segoe UI" w:eastAsia="Times New Roman" w:hAnsi="Segoe UI" w:cs="Segoe UI"/>
+          <w:color w:val="334155"/>
+          <w:sz w:val="14"/>
+          <w:szCs w:val="14"/>
+        </w:rPr>
+      </w:pPr>
+      <w:r>
+        <w:rPr>
+          <w:rFonts w:ascii="Segoe UI" w:eastAsia="Times New Roman" w:hAnsi="Segoe UI" w:cs="Segoe UI"/>
+          <w:b/>
+          <w:bCs/>
+          <w:color w:val="0F172A"/>
+          <w:sz w:val="14"/>
+          <w:szCs w:val="14"/>
+        </w:rPr>
+        <w:t>Ecosistema RRHH &amp; Soporte TI:</w:t>
+      </w:r>
+      <w:r>
+        <w:rPr>
+          <w:rFonts w:ascii="Segoe UI" w:eastAsia="Times New Roman" w:hAnsi="Segoe UI" w:cs="Segoe UI"/>
+          <w:color w:val="334155"/>
+          <w:sz w:val="14"/>
+          <w:szCs w:val="14"/>
+        </w:rPr>
+        <w:t xml:space="preserve"> </w:t>
+      </w:r>
+      <w:r>
+        <w:rPr>
+          <w:rFonts w:ascii="Segoe UI" w:eastAsia="Times New Roman" w:hAnsi="Segoe UI" w:cs="Segoe UI"/>
+          <w:color w:val="334155"/>
+          <w:sz w:val="14"/>
+          <w:szCs w:val="14"/>
+        </w:rPr>
+        <w:t>Desarrollo web con Angular + backend RESTful, app móvil .NET MAUI y soporte Active Directory / SAP.</w:t>
+      </w:r>
+    </w:p>
+    <w:p>
+      <w:pPr>
+        <w:shd w:val="clear" w:color="auto" w:fill="FFFFFF"/>
+        <w:divId w:val="1397390064"/>
         <w:rPr>
           <w:rFonts w:ascii="Segoe UI" w:eastAsia="Times New Roman" w:hAnsi="Segoe UI" w:cs="Segoe UI"/>
           <w:color w:val="1E293B"/>
@@ -1697,8 +2027,7 @@
           <w:rStyle w:val="job-role1"/>
           <w:rFonts w:ascii="Segoe UI" w:eastAsia="Times New Roman" w:hAnsi="Segoe UI" w:cs="Segoe UI"/>
         </w:rPr>
-        <w:lastRenderedPageBreak/>
-        <w:t>Coordinador &amp; Back Office DIRECTV</w:t>
+        <w:t>Asesor CSR1 y ATC Netflix</w:t>
       </w:r>
       <w:r>
         <w:rPr>
@@ -1714,7 +2043,7 @@
           <w:rStyle w:val="job-company1"/>
           <w:rFonts w:ascii="Segoe UI" w:eastAsia="Times New Roman" w:hAnsi="Segoe UI" w:cs="Segoe UI"/>
         </w:rPr>
-        <w:t>DIRECTV</w:t>
+        <w:t>Teleperformance</w:t>
       </w:r>
       <w:r>
         <w:rPr>
@@ -1729,7 +2058,7 @@
     <w:p>
       <w:pPr>
         <w:shd w:val="clear" w:color="auto" w:fill="FFFFFF"/>
-        <w:divId w:val="1952122505"/>
+        <w:divId w:val="1938520590"/>
         <w:rPr>
           <w:rFonts w:ascii="Segoe UI" w:eastAsia="Times New Roman" w:hAnsi="Segoe UI" w:cs="Segoe UI"/>
           <w:color w:val="1E293B"/>
@@ -1742,7 +2071,7 @@
           <w:rStyle w:val="job-period1"/>
           <w:rFonts w:ascii="Segoe UI" w:eastAsia="Times New Roman" w:hAnsi="Segoe UI" w:cs="Segoe UI"/>
         </w:rPr>
-        <w:t>Feb 2020 – Feb 2022</w:t>
+        <w:t>Oct 2022 – Ene 2025</w:t>
       </w:r>
       <w:r>
         <w:rPr>
@@ -1763,7 +2092,7 @@
         <w:shd w:val="clear" w:color="auto" w:fill="FFFFFF"/>
         <w:spacing w:before="100" w:beforeAutospacing="1" w:after="15"/>
         <w:ind w:left="870"/>
-        <w:divId w:val="1761021845"/>
+        <w:divId w:val="418209489"/>
         <w:rPr>
           <w:rFonts w:ascii="Segoe UI" w:eastAsia="Times New Roman" w:hAnsi="Segoe UI" w:cs="Segoe UI"/>
           <w:color w:val="334155"/>
@@ -1778,13 +2107,13 @@
           <w:sz w:val="14"/>
           <w:szCs w:val="14"/>
         </w:rPr>
-        <w:t>Coordinación de asignaciones, análisis de backlog comercial, rutas técnicas y gestión de KPIs operativos en TOA y Siebel.</w:t>
+        <w:t>Atención al cliente, diagnóstico y resolución de incidencias técnicas en la plataforma Netflix. Soporte a cuentas corporativas.</w:t>
       </w:r>
     </w:p>
     <w:p>
       <w:pPr>
         <w:shd w:val="clear" w:color="auto" w:fill="FFFFFF"/>
-        <w:divId w:val="1698191826"/>
+        <w:divId w:val="558781800"/>
         <w:rPr>
           <w:rFonts w:ascii="Segoe UI" w:eastAsia="Times New Roman" w:hAnsi="Segoe UI" w:cs="Segoe UI"/>
           <w:color w:val="1E293B"/>
@@ -1797,7 +2126,7 @@
           <w:rStyle w:val="job-role1"/>
           <w:rFonts w:ascii="Segoe UI" w:eastAsia="Times New Roman" w:hAnsi="Segoe UI" w:cs="Segoe UI"/>
         </w:rPr>
-        <w:t>Asistente Administrativo &amp; Técnico</w:t>
+        <w:t>Coordinador &amp; Back Office DIRECTV</w:t>
       </w:r>
       <w:r>
         <w:rPr>
@@ -1813,7 +2142,7 @@
           <w:rStyle w:val="job-company1"/>
           <w:rFonts w:ascii="Segoe UI" w:eastAsia="Times New Roman" w:hAnsi="Segoe UI" w:cs="Segoe UI"/>
         </w:rPr>
-        <w:t>Ezentis Perú S.A.C.</w:t>
+        <w:t>DIRECTV</w:t>
       </w:r>
       <w:r>
         <w:rPr>
@@ -1828,7 +2157,7 @@
     <w:p>
       <w:pPr>
         <w:shd w:val="clear" w:color="auto" w:fill="FFFFFF"/>
-        <w:divId w:val="37245457"/>
+        <w:divId w:val="428699374"/>
         <w:rPr>
           <w:rFonts w:ascii="Segoe UI" w:eastAsia="Times New Roman" w:hAnsi="Segoe UI" w:cs="Segoe UI"/>
           <w:color w:val="1E293B"/>
@@ -1841,7 +2170,7 @@
           <w:rStyle w:val="job-period1"/>
           <w:rFonts w:ascii="Segoe UI" w:eastAsia="Times New Roman" w:hAnsi="Segoe UI" w:cs="Segoe UI"/>
         </w:rPr>
-        <w:t>Mar 2019 – Dic 2019</w:t>
+        <w:t>Feb 2020 – Feb 2022</w:t>
       </w:r>
       <w:r>
         <w:rPr>
@@ -1862,7 +2191,7 @@
         <w:shd w:val="clear" w:color="auto" w:fill="FFFFFF"/>
         <w:spacing w:before="100" w:beforeAutospacing="1" w:after="15"/>
         <w:ind w:left="870"/>
-        <w:divId w:val="1573075588"/>
+        <w:divId w:val="2140222940"/>
         <w:rPr>
           <w:rFonts w:ascii="Segoe UI" w:eastAsia="Times New Roman" w:hAnsi="Segoe UI" w:cs="Segoe UI"/>
           <w:color w:val="334155"/>
@@ -1877,132 +2206,13 @@
           <w:sz w:val="14"/>
           <w:szCs w:val="14"/>
         </w:rPr>
-        <w:t xml:space="preserve">Control de inventarios en sistema </w:t>
-      </w:r>
-      <w:r>
-        <w:rPr>
-          <w:rFonts w:ascii="Segoe UI" w:eastAsia="Times New Roman" w:hAnsi="Segoe UI" w:cs="Segoe UI"/>
-          <w:b/>
-          <w:bCs/>
-          <w:color w:val="0F172A"/>
-          <w:sz w:val="14"/>
-          <w:szCs w:val="14"/>
-        </w:rPr>
-        <w:t>SAP</w:t>
-      </w:r>
-      <w:r>
-        <w:rPr>
-          <w:rFonts w:ascii="Segoe UI" w:eastAsia="Times New Roman" w:hAnsi="Segoe UI" w:cs="Segoe UI"/>
-          <w:color w:val="334155"/>
-          <w:sz w:val="14"/>
-          <w:szCs w:val="14"/>
-        </w:rPr>
-        <w:t xml:space="preserve"> y configuración de instalaciones HFC e internet.</w:t>
+        <w:t>Coordinación de asignaciones, análisis de backlog comercial y gestión de KPIs operativos mediante plataformas TOA y Siebel.</w:t>
       </w:r>
     </w:p>
     <w:p>
       <w:pPr>
         <w:shd w:val="clear" w:color="auto" w:fill="FFFFFF"/>
-        <w:divId w:val="8528053"/>
-        <w:rPr>
-          <w:rFonts w:ascii="Segoe UI" w:eastAsia="Times New Roman" w:hAnsi="Segoe UI" w:cs="Segoe UI"/>
-          <w:color w:val="1E293B"/>
-          <w:sz w:val="15"/>
-          <w:szCs w:val="15"/>
-        </w:rPr>
-      </w:pPr>
-      <w:r>
-        <w:rPr>
-          <w:rStyle w:val="job-role1"/>
-          <w:rFonts w:ascii="Segoe UI" w:eastAsia="Times New Roman" w:hAnsi="Segoe UI" w:cs="Segoe UI"/>
-        </w:rPr>
-        <w:t>Técnico Ensamblaje y Mantenimiento</w:t>
-      </w:r>
-      <w:r>
-        <w:rPr>
-          <w:rFonts w:ascii="Segoe UI" w:eastAsia="Times New Roman" w:hAnsi="Segoe UI" w:cs="Segoe UI"/>
-          <w:color w:val="1E293B"/>
-          <w:sz w:val="15"/>
-          <w:szCs w:val="15"/>
-        </w:rPr>
-        <w:t xml:space="preserve"> – </w:t>
-      </w:r>
-      <w:r>
-        <w:rPr>
-          <w:rStyle w:val="job-company1"/>
-          <w:rFonts w:ascii="Segoe UI" w:eastAsia="Times New Roman" w:hAnsi="Segoe UI" w:cs="Segoe UI"/>
-        </w:rPr>
-        <w:t>Artechnology</w:t>
-      </w:r>
-      <w:r>
-        <w:rPr>
-          <w:rFonts w:ascii="Segoe UI" w:eastAsia="Times New Roman" w:hAnsi="Segoe UI" w:cs="Segoe UI"/>
-          <w:color w:val="1E293B"/>
-          <w:sz w:val="15"/>
-          <w:szCs w:val="15"/>
-        </w:rPr>
-        <w:t xml:space="preserve"> </w:t>
-      </w:r>
-    </w:p>
-    <w:p>
-      <w:pPr>
-        <w:shd w:val="clear" w:color="auto" w:fill="FFFFFF"/>
-        <w:divId w:val="1097022711"/>
-        <w:rPr>
-          <w:rFonts w:ascii="Segoe UI" w:eastAsia="Times New Roman" w:hAnsi="Segoe UI" w:cs="Segoe UI"/>
-          <w:color w:val="1E293B"/>
-          <w:sz w:val="15"/>
-          <w:szCs w:val="15"/>
-        </w:rPr>
-      </w:pPr>
-      <w:r>
-        <w:rPr>
-          <w:rStyle w:val="job-period1"/>
-          <w:rFonts w:ascii="Segoe UI" w:eastAsia="Times New Roman" w:hAnsi="Segoe UI" w:cs="Segoe UI"/>
-        </w:rPr>
-        <w:t>2016 – 2017</w:t>
-      </w:r>
-      <w:r>
-        <w:rPr>
-          <w:rFonts w:ascii="Segoe UI" w:eastAsia="Times New Roman" w:hAnsi="Segoe UI" w:cs="Segoe UI"/>
-          <w:color w:val="1E293B"/>
-          <w:sz w:val="15"/>
-          <w:szCs w:val="15"/>
-        </w:rPr>
-        <w:t xml:space="preserve"> </w:t>
-      </w:r>
-    </w:p>
-    <w:p>
-      <w:pPr>
-        <w:numPr>
-          <w:ilvl w:val="0"/>
-          <w:numId w:val="5"/>
-        </w:numPr>
-        <w:shd w:val="clear" w:color="auto" w:fill="FFFFFF"/>
-        <w:spacing w:before="100" w:beforeAutospacing="1" w:after="15"/>
-        <w:ind w:left="870"/>
-        <w:divId w:val="776220042"/>
-        <w:rPr>
-          <w:rFonts w:ascii="Segoe UI" w:eastAsia="Times New Roman" w:hAnsi="Segoe UI" w:cs="Segoe UI"/>
-          <w:color w:val="334155"/>
-          <w:sz w:val="14"/>
-          <w:szCs w:val="14"/>
-        </w:rPr>
-      </w:pPr>
-      <w:r>
-        <w:rPr>
-          <w:rFonts w:ascii="Segoe UI" w:eastAsia="Times New Roman" w:hAnsi="Segoe UI" w:cs="Segoe UI"/>
-          <w:color w:val="334155"/>
-          <w:sz w:val="14"/>
-          <w:szCs w:val="14"/>
-        </w:rPr>
-        <w:t>Ensamblaje de hardware, mantenimiento predictivo/correctivo de equipos y soporte técnico informático.</w:t>
-      </w:r>
-    </w:p>
-    <w:p>
-      <w:pPr>
-        <w:shd w:val="clear" w:color="auto" w:fill="FFFFFF"/>
-        <w:divId w:val="541289872"/>
+        <w:divId w:val="1290626302"/>
         <w:rPr>
           <w:rFonts w:ascii="Segoe UI" w:eastAsia="Times New Roman" w:hAnsi="Segoe UI" w:cs="Segoe UI"/>
           <w:b/>
@@ -2031,14 +2241,14 @@
     <w:p>
       <w:pPr>
         <w:shd w:val="clear" w:color="auto" w:fill="F8FAFC"/>
-        <w:divId w:val="1391225144"/>
+        <w:divId w:val="104622824"/>
         <w:rPr>
           <w:rFonts w:ascii="Segoe UI" w:eastAsia="Times New Roman" w:hAnsi="Segoe UI" w:cs="Segoe UI"/>
           <w:b/>
           <w:bCs/>
           <w:color w:val="0F172A"/>
-          <w:sz w:val="14"/>
-          <w:szCs w:val="14"/>
+          <w:sz w:val="15"/>
+          <w:szCs w:val="15"/>
         </w:rPr>
       </w:pPr>
       <w:r>
@@ -2047,44 +2257,101 @@
           <w:b/>
           <w:bCs/>
           <w:color w:val="0F172A"/>
-          <w:sz w:val="14"/>
-          <w:szCs w:val="14"/>
-        </w:rPr>
-        <w:t>1. ERP ICO Logística &amp; Módulo TI</w:t>
+          <w:sz w:val="15"/>
+          <w:szCs w:val="15"/>
+        </w:rPr>
+        <w:t>1. Sistema ERP ICO Logística (Fullstack Java &amp; Angular)</w:t>
       </w:r>
     </w:p>
     <w:p>
       <w:pPr>
         <w:shd w:val="clear" w:color="auto" w:fill="F8FAFC"/>
-        <w:divId w:val="703213470"/>
+        <w:divId w:val="19479145"/>
         <w:rPr>
           <w:rFonts w:ascii="Segoe UI" w:eastAsia="Times New Roman" w:hAnsi="Segoe UI" w:cs="Segoe UI"/>
           <w:color w:val="475569"/>
-          <w:sz w:val="13"/>
-          <w:szCs w:val="13"/>
+          <w:sz w:val="14"/>
+          <w:szCs w:val="14"/>
         </w:rPr>
       </w:pPr>
       <w:r>
         <w:rPr>
           <w:rFonts w:ascii="Segoe UI" w:eastAsia="Times New Roman" w:hAnsi="Segoe UI" w:cs="Segoe UI"/>
           <w:color w:val="475569"/>
-          <w:sz w:val="13"/>
-          <w:szCs w:val="13"/>
-        </w:rPr>
-        <w:t>Java 21, Spring Boot, Node.js &amp; Angular. Cotizaciones PDF, trazas de errores y control patrimonial TI.</w:t>
+          <w:sz w:val="14"/>
+          <w:szCs w:val="14"/>
+        </w:rPr>
+        <w:t xml:space="preserve">Plataforma empresarial desarrollada con </w:t>
+      </w:r>
+      <w:r>
+        <w:rPr>
+          <w:rStyle w:val="Textoennegrita"/>
+          <w:rFonts w:ascii="Segoe UI" w:eastAsia="Times New Roman" w:hAnsi="Segoe UI" w:cs="Segoe UI"/>
+          <w:color w:val="475569"/>
+          <w:sz w:val="14"/>
+          <w:szCs w:val="14"/>
+        </w:rPr>
+        <w:t>Java 21</w:t>
+      </w:r>
+      <w:r>
+        <w:rPr>
+          <w:rFonts w:ascii="Segoe UI" w:eastAsia="Times New Roman" w:hAnsi="Segoe UI" w:cs="Segoe UI"/>
+          <w:color w:val="475569"/>
+          <w:sz w:val="14"/>
+          <w:szCs w:val="14"/>
+        </w:rPr>
+        <w:t xml:space="preserve">, </w:t>
+      </w:r>
+      <w:r>
+        <w:rPr>
+          <w:rStyle w:val="Textoennegrita"/>
+          <w:rFonts w:ascii="Segoe UI" w:eastAsia="Times New Roman" w:hAnsi="Segoe UI" w:cs="Segoe UI"/>
+          <w:color w:val="475569"/>
+          <w:sz w:val="14"/>
+          <w:szCs w:val="14"/>
+        </w:rPr>
+        <w:t>Spring Boot</w:t>
+      </w:r>
+      <w:r>
+        <w:rPr>
+          <w:rFonts w:ascii="Segoe UI" w:eastAsia="Times New Roman" w:hAnsi="Segoe UI" w:cs="Segoe UI"/>
+          <w:color w:val="475569"/>
+          <w:sz w:val="14"/>
+          <w:szCs w:val="14"/>
+        </w:rPr>
+        <w:t xml:space="preserve"> y </w:t>
+      </w:r>
+      <w:r>
+        <w:rPr>
+          <w:rStyle w:val="Textoennegrita"/>
+          <w:rFonts w:ascii="Segoe UI" w:eastAsia="Times New Roman" w:hAnsi="Segoe UI" w:cs="Segoe UI"/>
+          <w:color w:val="475569"/>
+          <w:sz w:val="14"/>
+          <w:szCs w:val="14"/>
+        </w:rPr>
+        <w:t>Angular</w:t>
+      </w:r>
+      <w:r>
+        <w:rPr>
+          <w:rFonts w:ascii="Segoe UI" w:eastAsia="Times New Roman" w:hAnsi="Segoe UI" w:cs="Segoe UI"/>
+          <w:color w:val="475569"/>
+          <w:sz w:val="14"/>
+          <w:szCs w:val="14"/>
+        </w:rPr>
+        <w:t>. Módulos de cotizaciones automatizadas en PDF, historial comercial, gestión de clientes y control relacional de activos de TI con firmas digitalizadas.</w:t>
       </w:r>
     </w:p>
     <w:p>
       <w:pPr>
         <w:shd w:val="clear" w:color="auto" w:fill="F8FAFC"/>
-        <w:divId w:val="1319651400"/>
+        <w:divId w:val="1794471580"/>
         <w:rPr>
           <w:rFonts w:ascii="Segoe UI" w:eastAsia="Times New Roman" w:hAnsi="Segoe UI" w:cs="Segoe UI"/>
           <w:b/>
           <w:bCs/>
           <w:color w:val="0F172A"/>
-          <w:sz w:val="14"/>
-          <w:szCs w:val="14"/>
+          <w:sz w:val="15"/>
+          <w:szCs w:val="15"/>
         </w:rPr>
       </w:pPr>
       <w:r>
@@ -2093,39 +2360,142 @@
           <w:b/>
           <w:bCs/>
           <w:color w:val="0F172A"/>
-          <w:sz w:val="14"/>
-          <w:szCs w:val="14"/>
-        </w:rPr>
-        <w:t>2. CRM Web &amp; App Móvil Comercial</w:t>
+          <w:sz w:val="15"/>
+          <w:szCs w:val="15"/>
+        </w:rPr>
+        <w:t>2. Ecosistema de Control de Asistencia y Personal</w:t>
       </w:r>
     </w:p>
     <w:p>
       <w:pPr>
         <w:shd w:val="clear" w:color="auto" w:fill="F8FAFC"/>
-        <w:divId w:val="29965180"/>
+        <w:divId w:val="1873304864"/>
         <w:rPr>
           <w:rFonts w:ascii="Segoe UI" w:eastAsia="Times New Roman" w:hAnsi="Segoe UI" w:cs="Segoe UI"/>
           <w:color w:val="475569"/>
-          <w:sz w:val="13"/>
-          <w:szCs w:val="13"/>
+          <w:sz w:val="14"/>
+          <w:szCs w:val="14"/>
         </w:rPr>
       </w:pPr>
       <w:r>
         <w:rPr>
           <w:rFonts w:ascii="Segoe UI" w:eastAsia="Times New Roman" w:hAnsi="Segoe UI" w:cs="Segoe UI"/>
           <w:color w:val="475569"/>
-          <w:sz w:val="13"/>
-          <w:szCs w:val="13"/>
-        </w:rPr>
-        <w:t xml:space="preserve">App nativa en </w:t>
+          <w:sz w:val="14"/>
+          <w:szCs w:val="14"/>
+        </w:rPr>
+        <w:t>Solución híbrida compuesta por aplicación móvil (</w:t>
       </w:r>
       <w:r>
         <w:rPr>
           <w:rStyle w:val="Textoennegrita"/>
           <w:rFonts w:ascii="Segoe UI" w:eastAsia="Times New Roman" w:hAnsi="Segoe UI" w:cs="Segoe UI"/>
           <w:color w:val="475569"/>
-          <w:sz w:val="13"/>
-          <w:szCs w:val="13"/>
+          <w:sz w:val="14"/>
+          <w:szCs w:val="14"/>
+        </w:rPr>
+        <w:t>.NET MAUI</w:t>
+      </w:r>
+      <w:r>
+        <w:rPr>
+          <w:rFonts w:ascii="Segoe UI" w:eastAsia="Times New Roman" w:hAnsi="Segoe UI" w:cs="Segoe UI"/>
+          <w:color w:val="475569"/>
+          <w:sz w:val="14"/>
+          <w:szCs w:val="14"/>
+        </w:rPr>
+        <w:t xml:space="preserve">) para marcas de horario y plataforma web administrativa en </w:t>
+      </w:r>
+      <w:r>
+        <w:rPr>
+          <w:rStyle w:val="Textoennegrita"/>
+          <w:rFonts w:ascii="Segoe UI" w:eastAsia="Times New Roman" w:hAnsi="Segoe UI" w:cs="Segoe UI"/>
+          <w:color w:val="475569"/>
+          <w:sz w:val="14"/>
+          <w:szCs w:val="14"/>
+        </w:rPr>
+        <w:t>Angular</w:t>
+      </w:r>
+      <w:r>
+        <w:rPr>
+          <w:rFonts w:ascii="Segoe UI" w:eastAsia="Times New Roman" w:hAnsi="Segoe UI" w:cs="Segoe UI"/>
+          <w:color w:val="475569"/>
+          <w:sz w:val="14"/>
+          <w:szCs w:val="14"/>
+        </w:rPr>
+        <w:t xml:space="preserve"> con APIs en </w:t>
+      </w:r>
+      <w:r>
+        <w:rPr>
+          <w:rStyle w:val="Textoennegrita"/>
+          <w:rFonts w:ascii="Segoe UI" w:eastAsia="Times New Roman" w:hAnsi="Segoe UI" w:cs="Segoe UI"/>
+          <w:color w:val="475569"/>
+          <w:sz w:val="14"/>
+          <w:szCs w:val="14"/>
+        </w:rPr>
+        <w:t>Spring Boot / .NET 10</w:t>
+      </w:r>
+      <w:r>
+        <w:rPr>
+          <w:rFonts w:ascii="Segoe UI" w:eastAsia="Times New Roman" w:hAnsi="Segoe UI" w:cs="Segoe UI"/>
+          <w:color w:val="475569"/>
+          <w:sz w:val="14"/>
+          <w:szCs w:val="14"/>
+        </w:rPr>
+        <w:t xml:space="preserve"> y SQL Server.</w:t>
+      </w:r>
+    </w:p>
+    <w:p>
+      <w:pPr>
+        <w:shd w:val="clear" w:color="auto" w:fill="F8FAFC"/>
+        <w:divId w:val="597059049"/>
+        <w:rPr>
+          <w:rFonts w:ascii="Segoe UI" w:eastAsia="Times New Roman" w:hAnsi="Segoe UI" w:cs="Segoe UI"/>
+          <w:b/>
+          <w:bCs/>
+          <w:color w:val="0F172A"/>
+          <w:sz w:val="15"/>
+          <w:szCs w:val="15"/>
+        </w:rPr>
+      </w:pPr>
+      <w:r>
+        <w:rPr>
+          <w:rFonts w:ascii="Segoe UI" w:eastAsia="Times New Roman" w:hAnsi="Segoe UI" w:cs="Segoe UI"/>
+          <w:b/>
+          <w:bCs/>
+          <w:color w:val="0F172A"/>
+          <w:sz w:val="15"/>
+          <w:szCs w:val="15"/>
+        </w:rPr>
+        <w:t>3. Aplicación Móvil Comercial "ICO Agenda" (Kotlin)</w:t>
+      </w:r>
+    </w:p>
+    <w:p>
+      <w:pPr>
+        <w:shd w:val="clear" w:color="auto" w:fill="F8FAFC"/>
+        <w:divId w:val="1259485929"/>
+        <w:rPr>
+          <w:rFonts w:ascii="Segoe UI" w:eastAsia="Times New Roman" w:hAnsi="Segoe UI" w:cs="Segoe UI"/>
+          <w:color w:val="475569"/>
+          <w:sz w:val="14"/>
+          <w:szCs w:val="14"/>
+        </w:rPr>
+      </w:pPr>
+      <w:r>
+        <w:rPr>
+          <w:rFonts w:ascii="Segoe UI" w:eastAsia="Times New Roman" w:hAnsi="Segoe UI" w:cs="Segoe UI"/>
+          <w:color w:val="475569"/>
+          <w:sz w:val="14"/>
+          <w:szCs w:val="14"/>
+        </w:rPr>
+        <w:t xml:space="preserve">Aplicación móvil nativa desarrollada en </w:t>
+      </w:r>
+      <w:r>
+        <w:rPr>
+          <w:rStyle w:val="Textoennegrita"/>
+          <w:rFonts w:ascii="Segoe UI" w:eastAsia="Times New Roman" w:hAnsi="Segoe UI" w:cs="Segoe UI"/>
+          <w:color w:val="475569"/>
+          <w:sz w:val="14"/>
+          <w:szCs w:val="14"/>
         </w:rPr>
         <w:t>Kotlin</w:t>
       </w:r>
@@ -2133,23 +2503,32 @@
         <w:rPr>
           <w:rFonts w:ascii="Segoe UI" w:eastAsia="Times New Roman" w:hAnsi="Segoe UI" w:cs="Segoe UI"/>
           <w:color w:val="475569"/>
-          <w:sz w:val="13"/>
-          <w:szCs w:val="13"/>
-        </w:rPr>
-        <w:t xml:space="preserve"> sincronizada en tiempo real con CRM Web Angular y Spring Boot/Node.js.</w:t>
+          <w:sz w:val="14"/>
+          <w:szCs w:val="14"/>
+        </w:rPr>
+        <w:t xml:space="preserve"> </w:t>
+      </w:r>
+      <w:r>
+        <w:rPr>
+          <w:rFonts w:ascii="Segoe UI" w:eastAsia="Times New Roman" w:hAnsi="Segoe UI" w:cs="Segoe UI"/>
+          <w:color w:val="475569"/>
+          <w:sz w:val="14"/>
+          <w:szCs w:val="14"/>
+        </w:rPr>
+        <w:t>(Android Studio) para la fuerza de ventas en campo, permitiendo el agendamiento de tareas, visitas a clientes y registro de interacciones comerciales.</w:t>
       </w:r>
     </w:p>
     <w:p>
       <w:pPr>
         <w:shd w:val="clear" w:color="auto" w:fill="F8FAFC"/>
-        <w:divId w:val="102455949"/>
+        <w:divId w:val="303777219"/>
         <w:rPr>
           <w:rFonts w:ascii="Segoe UI" w:eastAsia="Times New Roman" w:hAnsi="Segoe UI" w:cs="Segoe UI"/>
           <w:b/>
           <w:bCs/>
           <w:color w:val="0F172A"/>
-          <w:sz w:val="14"/>
-          <w:szCs w:val="14"/>
+          <w:sz w:val="15"/>
+          <w:szCs w:val="15"/>
         </w:rPr>
       </w:pPr>
       <w:r>
@@ -2158,96 +2537,88 @@
           <w:b/>
           <w:bCs/>
           <w:color w:val="0F172A"/>
-          <w:sz w:val="14"/>
-          <w:szCs w:val="14"/>
-        </w:rPr>
-        <w:t>3. Backend Node.js &amp; AWS Cloud</w:t>
+          <w:sz w:val="15"/>
+          <w:szCs w:val="15"/>
+        </w:rPr>
+        <w:t>4. CRM Web Back Office (Angular &amp; Spring Boot)</w:t>
       </w:r>
     </w:p>
     <w:p>
       <w:pPr>
         <w:shd w:val="clear" w:color="auto" w:fill="F8FAFC"/>
-        <w:divId w:val="3021048"/>
+        <w:divId w:val="1931311014"/>
         <w:rPr>
           <w:rFonts w:ascii="Segoe UI" w:eastAsia="Times New Roman" w:hAnsi="Segoe UI" w:cs="Segoe UI"/>
           <w:color w:val="475569"/>
-          <w:sz w:val="13"/>
-          <w:szCs w:val="13"/>
+          <w:sz w:val="14"/>
+          <w:szCs w:val="14"/>
         </w:rPr>
       </w:pPr>
       <w:r>
         <w:rPr>
           <w:rFonts w:ascii="Segoe UI" w:eastAsia="Times New Roman" w:hAnsi="Segoe UI" w:cs="Segoe UI"/>
           <w:color w:val="475569"/>
-          <w:sz w:val="13"/>
-          <w:szCs w:val="13"/>
-        </w:rPr>
-        <w:t xml:space="preserve">Microservicios Express.js integrados en </w:t>
+          <w:sz w:val="14"/>
+          <w:szCs w:val="14"/>
+        </w:rPr>
+        <w:t xml:space="preserve">Plataforma web administrativa centralizada en </w:t>
       </w:r>
       <w:r>
         <w:rPr>
           <w:rStyle w:val="Textoennegrita"/>
           <w:rFonts w:ascii="Segoe UI" w:eastAsia="Times New Roman" w:hAnsi="Segoe UI" w:cs="Segoe UI"/>
           <w:color w:val="475569"/>
-          <w:sz w:val="13"/>
-          <w:szCs w:val="13"/>
-        </w:rPr>
-        <w:t>AWS (S3, Lambda, CloudWatch)</w:t>
+          <w:sz w:val="14"/>
+          <w:szCs w:val="14"/>
+        </w:rPr>
+        <w:t>Angular</w:t>
       </w:r>
       <w:r>
         <w:rPr>
           <w:rFonts w:ascii="Segoe UI" w:eastAsia="Times New Roman" w:hAnsi="Segoe UI" w:cs="Segoe UI"/>
           <w:color w:val="475569"/>
-          <w:sz w:val="13"/>
-          <w:szCs w:val="13"/>
-        </w:rPr>
-        <w:t xml:space="preserve"> con análisis de trazas.</w:t>
-      </w:r>
-    </w:p>
-    <w:p>
-      <w:pPr>
-        <w:shd w:val="clear" w:color="auto" w:fill="F8FAFC"/>
-        <w:divId w:val="2103648433"/>
-        <w:rPr>
-          <w:rFonts w:ascii="Segoe UI" w:eastAsia="Times New Roman" w:hAnsi="Segoe UI" w:cs="Segoe UI"/>
-          <w:b/>
-          <w:bCs/>
-          <w:color w:val="0F172A"/>
-          <w:sz w:val="14"/>
-          <w:szCs w:val="14"/>
-        </w:rPr>
-      </w:pPr>
-      <w:r>
-        <w:rPr>
-          <w:rFonts w:ascii="Segoe UI" w:eastAsia="Times New Roman" w:hAnsi="Segoe UI" w:cs="Segoe UI"/>
-          <w:b/>
-          <w:bCs/>
-          <w:color w:val="0F172A"/>
-          <w:sz w:val="14"/>
-          <w:szCs w:val="14"/>
-        </w:rPr>
-        <w:t>4. Ecosistema Asistencia RRHH</w:t>
-      </w:r>
-    </w:p>
-    <w:p>
-      <w:pPr>
-        <w:shd w:val="clear" w:color="auto" w:fill="F8FAFC"/>
-        <w:divId w:val="777338686"/>
-        <w:rPr>
+          <w:sz w:val="14"/>
+          <w:szCs w:val="14"/>
+        </w:rPr>
+        <w:t xml:space="preserve"> para supervisión comercial de Back Office. </w:t>
+      </w:r>
+      <w:r>
+        <w:rPr>
+          <w:rStyle w:val="Textoennegrita"/>
           <w:rFonts w:ascii="Segoe UI" w:eastAsia="Times New Roman" w:hAnsi="Segoe UI" w:cs="Segoe UI"/>
           <w:color w:val="475569"/>
-          <w:sz w:val="13"/>
-          <w:szCs w:val="13"/>
-        </w:rPr>
-      </w:pPr>
+          <w:sz w:val="14"/>
+          <w:szCs w:val="14"/>
+        </w:rPr>
+        <w:t>Integración Híbrida:</w:t>
+      </w:r>
       <w:r>
         <w:rPr>
           <w:rFonts w:ascii="Segoe UI" w:eastAsia="Times New Roman" w:hAnsi="Segoe UI" w:cs="Segoe UI"/>
           <w:color w:val="475569"/>
-          <w:sz w:val="13"/>
-          <w:szCs w:val="13"/>
-        </w:rPr>
-        <w:t>App móvil (.NET MAUI) + Panel Web Angular y backend Spring Boot / SQL Server.</w:t>
+          <w:sz w:val="14"/>
+          <w:szCs w:val="14"/>
+        </w:rPr>
+        <w:t xml:space="preserve"> Sincronización en tiempo real entre la App Móvil (Kotlin) y el CRM Web mediante APIs RESTful en </w:t>
+      </w:r>
+      <w:r>
+        <w:rPr>
+          <w:rStyle w:val="Textoennegrita"/>
+          <w:rFonts w:ascii="Segoe UI" w:eastAsia="Times New Roman" w:hAnsi="Segoe UI" w:cs="Segoe UI"/>
+          <w:color w:val="475569"/>
+          <w:sz w:val="14"/>
+          <w:szCs w:val="14"/>
+        </w:rPr>
+        <w:t>Spring Boot</w:t>
+      </w:r>
+      <w:r>
+        <w:rPr>
+          <w:rFonts w:ascii="Segoe UI" w:eastAsia="Times New Roman" w:hAnsi="Segoe UI" w:cs="Segoe UI"/>
+          <w:color w:val="475569"/>
+          <w:sz w:val="14"/>
+          <w:szCs w:val="14"/>
+        </w:rPr>
+        <w:t xml:space="preserve"> y SQL Server.</w:t>
       </w:r>
     </w:p>
     <w:sectPr>
@@ -2263,9 +2634,9 @@
 <file path=word/numbering.xml><?xml version="1.0" encoding="utf-8"?>
 <w:numbering xmlns:wpc="http://schemas.microsoft.com/office/word/2010/wordprocessingCanvas" xmlns:cx="http://schemas.microsoft.com/office/drawing/2014/chartex" xmlns:cx1="http://schemas.microsoft.com/office/drawing/2015/9/8/chartex" xmlns:cx2="http://schemas.microsoft.com/office/drawing/2015/10/21/chartex" xmlns:cx3="http://schemas.microsoft.com/office/drawing/2016/5/9/chartex" xmlns:cx4="http://schemas.microsoft.com/office/drawing/2016/5/10/chartex" xmlns:cx5="http://schemas.microsoft.com/office/drawing/2016/5/11/chartex" xmlns:cx6="http://schemas.microsoft.com/office/drawing/2016/5/12/chartex" xmlns:cx7="http://schemas.microsoft.com/office/drawing/2016/5/13/chartex" xmlns:cx8="http://schemas.microsoft.com/office/drawing/2016/5/14/chartex" xmlns:mc="http://schemas.openxmlformats.org/markup-compatibility/2006" xmlns:aink="http://schemas.microsoft.com/office/drawing/2016/ink" xmlns:am3d="http://schemas.microsoft.com/office/drawing/2017/model3d" xmlns:o="urn:schemas-microsoft-com:office:office" xmlns:oel="http://schemas.microsoft.com/office/2019/extlst" xmlns:r="http://schemas.openxmlformats.org/officeDocument/2006/relationships" xmlns:m="http://schemas.openxmlformats.org/officeDocument/2006/math" xmlns:v="urn:schemas-microsoft-com:vml" xmlns:wp14="http://schemas.microsoft.com/office/word/2010/wordprocessingDrawing" xmlns:wp="http://schemas.openxmlformats.org/drawingml/2006/wordprocessingDrawing" xmlns:w10="urn:schemas-microsoft-com:office:word" xmlns:w="http://schemas.openxmlformats.org/wordprocessingml/2006/main" xmlns:w14="http://schemas.microsoft.com/office/word/2010/wordml" xmlns:w15="http://schemas.microsoft.com/office/word/2012/wordml" xmlns:w16cex="http://schemas.microsoft.com/office/word/2018/wordml/cex" xmlns:w16cid="http://schemas.microsoft.com/office/word/2016/wordml/cid" xmlns:w16="http://schemas.microsoft.com/office/word/2018/wordml" xmlns:w16sdtdh="http://schemas.microsoft.com/office/word/2020/wordml/sdtdatahash" xmlns:w16se="http://schemas.microsoft.com/office/word/2015/wordml/symex" xmlns:wpg="http://schemas.microsoft.com/office/word/2010/wordprocessingGroup" xmlns:wpi="http://schemas.microsoft.com/office/word/2010/wordprocessingInk" xmlns:wne="http://schemas.microsoft.com/office/word/2006/wordml" xmlns:wps="http://schemas.microsoft.com/office/word/2010/wordprocessingShape" mc:Ignorable="w14 w15 w16se w16cid w16 w16cex w16sdtdh wp14">
   <w:abstractNum w:abstractNumId="0" w15:restartNumberingAfterBreak="0">
-    <w:nsid w:val="21242025"/>
+    <w:nsid w:val="1604523F"/>
     <w:multiLevelType w:val="multilevel"/>
-    <w:tmpl w:val="B7A0FE32"/>
+    <w:tmpl w:val="E7FC66E2"/>
     <w:lvl w:ilvl="0">
       <w:start w:val="1"/>
       <w:numFmt w:val="bullet"/>
@@ -2412,9 +2783,9 @@
     </w:lvl>
   </w:abstractNum>
   <w:abstractNum w:abstractNumId="1" w15:restartNumberingAfterBreak="0">
-    <w:nsid w:val="3B6B3338"/>
+    <w:nsid w:val="27BF0049"/>
     <w:multiLevelType w:val="multilevel"/>
-    <w:tmpl w:val="5A029C1E"/>
+    <w:tmpl w:val="4C3048DE"/>
     <w:lvl w:ilvl="0">
       <w:start w:val="1"/>
       <w:numFmt w:val="bullet"/>
@@ -2561,9 +2932,158 @@
     </w:lvl>
   </w:abstractNum>
   <w:abstractNum w:abstractNumId="2" w15:restartNumberingAfterBreak="0">
-    <w:nsid w:val="43874BF7"/>
+    <w:nsid w:val="32397982"/>
     <w:multiLevelType w:val="multilevel"/>
-    <w:tmpl w:val="F7DA0324"/>
+    <w:tmpl w:val="64E29B0C"/>
+    <w:lvl w:ilvl="0">
+      <w:start w:val="1"/>
+      <w:numFmt w:val="bullet"/>
+      <w:lvlText w:val=""/>
+      <w:lvlJc w:val="left"/>
+      <w:pPr>
+        <w:tabs>
+          <w:tab w:val="num" w:pos="720"/>
+        </w:tabs>
+        <w:ind w:left="720" w:hanging="360"/>
+      </w:pPr>
+      <w:rPr>
+        <w:rFonts w:ascii="Symbol" w:hAnsi="Symbol" w:hint="default"/>
+        <w:sz w:val="20"/>
+      </w:rPr>
+    </w:lvl>
+    <w:lvl w:ilvl="1" w:tentative="1">
+      <w:start w:val="1"/>
+      <w:numFmt w:val="bullet"/>
+      <w:lvlText w:val="o"/>
+      <w:lvlJc w:val="left"/>
+      <w:pPr>
+        <w:tabs>
+          <w:tab w:val="num" w:pos="1440"/>
+        </w:tabs>
+        <w:ind w:left="1440" w:hanging="360"/>
+      </w:pPr>
+      <w:rPr>
+        <w:rFonts w:ascii="Courier New" w:hAnsi="Courier New" w:hint="default"/>
+        <w:sz w:val="20"/>
+      </w:rPr>
+    </w:lvl>
+    <w:lvl w:ilvl="2" w:tentative="1">
+      <w:start w:val="1"/>
+      <w:numFmt w:val="bullet"/>
+      <w:lvlText w:val=""/>
+      <w:lvlJc w:val="left"/>
+      <w:pPr>
+        <w:tabs>
+          <w:tab w:val="num" w:pos="2160"/>
+        </w:tabs>
+        <w:ind w:left="2160" w:hanging="360"/>
+      </w:pPr>
+      <w:rPr>
+        <w:rFonts w:ascii="Wingdings" w:hAnsi="Wingdings" w:hint="default"/>
+        <w:sz w:val="20"/>
+      </w:rPr>
+    </w:lvl>
+    <w:lvl w:ilvl="3" w:tentative="1">
+      <w:start w:val="1"/>
+      <w:numFmt w:val="bullet"/>
+      <w:lvlText w:val=""/>
+      <w:lvlJc w:val="left"/>
+      <w:pPr>
+        <w:tabs>
+          <w:tab w:val="num" w:pos="2880"/>
+        </w:tabs>
+        <w:ind w:left="2880" w:hanging="360"/>
+      </w:pPr>
+      <w:rPr>
+        <w:rFonts w:ascii="Wingdings" w:hAnsi="Wingdings" w:hint="default"/>
+        <w:sz w:val="20"/>
+      </w:rPr>
+    </w:lvl>
+    <w:lvl w:ilvl="4" w:tentative="1">
+      <w:start w:val="1"/>
+      <w:numFmt w:val="bullet"/>
+      <w:lvlText w:val=""/>
+      <w:lvlJc w:val="left"/>
+      <w:pPr>
+        <w:tabs>
+          <w:tab w:val="num" w:pos="3600"/>
+        </w:tabs>
+        <w:ind w:left="3600" w:hanging="360"/>
+      </w:pPr>
+      <w:rPr>
+        <w:rFonts w:ascii="Wingdings" w:hAnsi="Wingdings" w:hint="default"/>
+        <w:sz w:val="20"/>
+      </w:rPr>
+    </w:lvl>
+    <w:lvl w:ilvl="5" w:tentative="1">
+      <w:start w:val="1"/>
+      <w:numFmt w:val="bullet"/>
+      <w:lvlText w:val=""/>
+      <w:lvlJc w:val="left"/>
+      <w:pPr>
+        <w:tabs>
+          <w:tab w:val="num" w:pos="4320"/>
+        </w:tabs>
+        <w:ind w:left="4320" w:hanging="360"/>
+      </w:pPr>
+      <w:rPr>
+        <w:rFonts w:ascii="Wingdings" w:hAnsi="Wingdings" w:hint="default"/>
+        <w:sz w:val="20"/>
+      </w:rPr>
+    </w:lvl>
+    <w:lvl w:ilvl="6" w:tentative="1">
+      <w:start w:val="1"/>
+      <w:numFmt w:val="bullet"/>
+      <w:lvlText w:val=""/>
+      <w:lvlJc w:val="left"/>
+      <w:pPr>
+        <w:tabs>
+          <w:tab w:val="num" w:pos="5040"/>
+        </w:tabs>
+        <w:ind w:left="5040" w:hanging="360"/>
+      </w:pPr>
+      <w:rPr>
+        <w:rFonts w:ascii="Wingdings" w:hAnsi="Wingdings" w:hint="default"/>
+        <w:sz w:val="20"/>
+      </w:rPr>
+    </w:lvl>
+    <w:lvl w:ilvl="7" w:tentative="1">
+      <w:start w:val="1"/>
+      <w:numFmt w:val="bullet"/>
+      <w:lvlText w:val=""/>
+      <w:lvlJc w:val="left"/>
+      <w:pPr>
+        <w:tabs>
+          <w:tab w:val="num" w:pos="5760"/>
+        </w:tabs>
+        <w:ind w:left="5760" w:hanging="360"/>
+      </w:pPr>
+      <w:rPr>
+        <w:rFonts w:ascii="Wingdings" w:hAnsi="Wingdings" w:hint="default"/>
+        <w:sz w:val="20"/>
+      </w:rPr>
+    </w:lvl>
+    <w:lvl w:ilvl="8" w:tentative="1">
+      <w:start w:val="1"/>
+      <w:numFmt w:val="bullet"/>
+      <w:lvlText w:val=""/>
+      <w:lvlJc w:val="left"/>
+      <w:pPr>
+        <w:tabs>
+          <w:tab w:val="num" w:pos="6480"/>
+        </w:tabs>
+        <w:ind w:left="6480" w:hanging="360"/>
+      </w:pPr>
+      <w:rPr>
+        <w:rFonts w:ascii="Wingdings" w:hAnsi="Wingdings" w:hint="default"/>
+        <w:sz w:val="20"/>
+      </w:rPr>
+    </w:lvl>
+  </w:abstractNum>
+  <w:abstractNum w:abstractNumId="3" w15:restartNumberingAfterBreak="0">
+    <w:nsid w:val="5205453B"/>
+    <w:multiLevelType w:val="multilevel"/>
+    <w:tmpl w:val="34CCBC5E"/>
     <w:lvl w:ilvl="0">
       <w:start w:val="1"/>
       <w:numFmt w:val="bullet"/>
@@ -2709,317 +3229,16 @@
       </w:rPr>
     </w:lvl>
   </w:abstractNum>
-  <w:abstractNum w:abstractNumId="3" w15:restartNumberingAfterBreak="0">
-    <w:nsid w:val="5B522DAF"/>
-    <w:multiLevelType w:val="multilevel"/>
-    <w:tmpl w:val="9E5CB72E"/>
-    <w:lvl w:ilvl="0">
-      <w:start w:val="1"/>
-      <w:numFmt w:val="bullet"/>
-      <w:lvlText w:val=""/>
-      <w:lvlJc w:val="left"/>
-      <w:pPr>
-        <w:tabs>
-          <w:tab w:val="num" w:pos="720"/>
-        </w:tabs>
-        <w:ind w:left="720" w:hanging="360"/>
-      </w:pPr>
-      <w:rPr>
-        <w:rFonts w:ascii="Symbol" w:hAnsi="Symbol" w:hint="default"/>
-        <w:sz w:val="20"/>
-      </w:rPr>
-    </w:lvl>
-    <w:lvl w:ilvl="1" w:tentative="1">
-      <w:start w:val="1"/>
-      <w:numFmt w:val="bullet"/>
-      <w:lvlText w:val=""/>
-      <w:lvlJc w:val="left"/>
-      <w:pPr>
-        <w:tabs>
-          <w:tab w:val="num" w:pos="1440"/>
-        </w:tabs>
-        <w:ind w:left="1440" w:hanging="360"/>
-      </w:pPr>
-      <w:rPr>
-        <w:rFonts w:ascii="Symbol" w:hAnsi="Symbol" w:hint="default"/>
-        <w:sz w:val="20"/>
-      </w:rPr>
-    </w:lvl>
-    <w:lvl w:ilvl="2" w:tentative="1">
-      <w:start w:val="1"/>
-      <w:numFmt w:val="bullet"/>
-      <w:lvlText w:val=""/>
-      <w:lvlJc w:val="left"/>
-      <w:pPr>
-        <w:tabs>
-          <w:tab w:val="num" w:pos="2160"/>
-        </w:tabs>
-        <w:ind w:left="2160" w:hanging="360"/>
-      </w:pPr>
-      <w:rPr>
-        <w:rFonts w:ascii="Symbol" w:hAnsi="Symbol" w:hint="default"/>
-        <w:sz w:val="20"/>
-      </w:rPr>
-    </w:lvl>
-    <w:lvl w:ilvl="3" w:tentative="1">
-      <w:start w:val="1"/>
-      <w:numFmt w:val="bullet"/>
-      <w:lvlText w:val=""/>
-      <w:lvlJc w:val="left"/>
-      <w:pPr>
-        <w:tabs>
-          <w:tab w:val="num" w:pos="2880"/>
-        </w:tabs>
-        <w:ind w:left="2880" w:hanging="360"/>
-      </w:pPr>
-      <w:rPr>
-        <w:rFonts w:ascii="Symbol" w:hAnsi="Symbol" w:hint="default"/>
-        <w:sz w:val="20"/>
-      </w:rPr>
-    </w:lvl>
-    <w:lvl w:ilvl="4" w:tentative="1">
-      <w:start w:val="1"/>
-      <w:numFmt w:val="bullet"/>
-      <w:lvlText w:val=""/>
-      <w:lvlJc w:val="left"/>
-      <w:pPr>
-        <w:tabs>
-          <w:tab w:val="num" w:pos="3600"/>
-        </w:tabs>
-        <w:ind w:left="3600" w:hanging="360"/>
-      </w:pPr>
-      <w:rPr>
-        <w:rFonts w:ascii="Symbol" w:hAnsi="Symbol" w:hint="default"/>
-        <w:sz w:val="20"/>
-      </w:rPr>
-    </w:lvl>
-    <w:lvl w:ilvl="5" w:tentative="1">
-      <w:start w:val="1"/>
-      <w:numFmt w:val="bullet"/>
-      <w:lvlText w:val=""/>
-      <w:lvlJc w:val="left"/>
-      <w:pPr>
-        <w:tabs>
-          <w:tab w:val="num" w:pos="4320"/>
-        </w:tabs>
-        <w:ind w:left="4320" w:hanging="360"/>
-      </w:pPr>
-      <w:rPr>
-        <w:rFonts w:ascii="Symbol" w:hAnsi="Symbol" w:hint="default"/>
-        <w:sz w:val="20"/>
-      </w:rPr>
-    </w:lvl>
-    <w:lvl w:ilvl="6" w:tentative="1">
-      <w:start w:val="1"/>
-      <w:numFmt w:val="bullet"/>
-      <w:lvlText w:val=""/>
-      <w:lvlJc w:val="left"/>
-      <w:pPr>
-        <w:tabs>
-          <w:tab w:val="num" w:pos="5040"/>
-        </w:tabs>
-        <w:ind w:left="5040" w:hanging="360"/>
-      </w:pPr>
-      <w:rPr>
-        <w:rFonts w:ascii="Symbol" w:hAnsi="Symbol" w:hint="default"/>
-        <w:sz w:val="20"/>
-      </w:rPr>
-    </w:lvl>
-    <w:lvl w:ilvl="7" w:tentative="1">
-      <w:start w:val="1"/>
-      <w:numFmt w:val="bullet"/>
-      <w:lvlText w:val=""/>
-      <w:lvlJc w:val="left"/>
-      <w:pPr>
-        <w:tabs>
-          <w:tab w:val="num" w:pos="5760"/>
-        </w:tabs>
-        <w:ind w:left="5760" w:hanging="360"/>
-      </w:pPr>
-      <w:rPr>
-        <w:rFonts w:ascii="Symbol" w:hAnsi="Symbol" w:hint="default"/>
-        <w:sz w:val="20"/>
-      </w:rPr>
-    </w:lvl>
-    <w:lvl w:ilvl="8" w:tentative="1">
-      <w:start w:val="1"/>
-      <w:numFmt w:val="bullet"/>
-      <w:lvlText w:val=""/>
-      <w:lvlJc w:val="left"/>
-      <w:pPr>
-        <w:tabs>
-          <w:tab w:val="num" w:pos="6480"/>
-        </w:tabs>
-        <w:ind w:left="6480" w:hanging="360"/>
-      </w:pPr>
-      <w:rPr>
-        <w:rFonts w:ascii="Symbol" w:hAnsi="Symbol" w:hint="default"/>
-        <w:sz w:val="20"/>
-      </w:rPr>
-    </w:lvl>
-  </w:abstractNum>
-  <w:abstractNum w:abstractNumId="4" w15:restartNumberingAfterBreak="0">
-    <w:nsid w:val="7C1C20A2"/>
-    <w:multiLevelType w:val="multilevel"/>
-    <w:tmpl w:val="597C8136"/>
-    <w:lvl w:ilvl="0">
-      <w:start w:val="1"/>
-      <w:numFmt w:val="bullet"/>
-      <w:lvlText w:val=""/>
-      <w:lvlJc w:val="left"/>
-      <w:pPr>
-        <w:tabs>
-          <w:tab w:val="num" w:pos="720"/>
-        </w:tabs>
-        <w:ind w:left="720" w:hanging="360"/>
-      </w:pPr>
-      <w:rPr>
-        <w:rFonts w:ascii="Symbol" w:hAnsi="Symbol" w:hint="default"/>
-        <w:sz w:val="20"/>
-      </w:rPr>
-    </w:lvl>
-    <w:lvl w:ilvl="1" w:tentative="1">
-      <w:start w:val="1"/>
-      <w:numFmt w:val="bullet"/>
-      <w:lvlText w:val=""/>
-      <w:lvlJc w:val="left"/>
-      <w:pPr>
-        <w:tabs>
-          <w:tab w:val="num" w:pos="1440"/>
-        </w:tabs>
-        <w:ind w:left="1440" w:hanging="360"/>
-      </w:pPr>
-      <w:rPr>
-        <w:rFonts w:ascii="Symbol" w:hAnsi="Symbol" w:hint="default"/>
-        <w:sz w:val="20"/>
-      </w:rPr>
-    </w:lvl>
-    <w:lvl w:ilvl="2" w:tentative="1">
-      <w:start w:val="1"/>
-      <w:numFmt w:val="bullet"/>
-      <w:lvlText w:val=""/>
-      <w:lvlJc w:val="left"/>
-      <w:pPr>
-        <w:tabs>
-          <w:tab w:val="num" w:pos="2160"/>
-        </w:tabs>
-        <w:ind w:left="2160" w:hanging="360"/>
-      </w:pPr>
-      <w:rPr>
-        <w:rFonts w:ascii="Symbol" w:hAnsi="Symbol" w:hint="default"/>
-        <w:sz w:val="20"/>
-      </w:rPr>
-    </w:lvl>
-    <w:lvl w:ilvl="3" w:tentative="1">
-      <w:start w:val="1"/>
-      <w:numFmt w:val="bullet"/>
-      <w:lvlText w:val=""/>
-      <w:lvlJc w:val="left"/>
-      <w:pPr>
-        <w:tabs>
-          <w:tab w:val="num" w:pos="2880"/>
-        </w:tabs>
-        <w:ind w:left="2880" w:hanging="360"/>
-      </w:pPr>
-      <w:rPr>
-        <w:rFonts w:ascii="Symbol" w:hAnsi="Symbol" w:hint="default"/>
-        <w:sz w:val="20"/>
-      </w:rPr>
-    </w:lvl>
-    <w:lvl w:ilvl="4" w:tentative="1">
-      <w:start w:val="1"/>
-      <w:numFmt w:val="bullet"/>
-      <w:lvlText w:val=""/>
-      <w:lvlJc w:val="left"/>
-      <w:pPr>
-        <w:tabs>
-          <w:tab w:val="num" w:pos="3600"/>
-        </w:tabs>
-        <w:ind w:left="3600" w:hanging="360"/>
-      </w:pPr>
-      <w:rPr>
-        <w:rFonts w:ascii="Symbol" w:hAnsi="Symbol" w:hint="default"/>
-        <w:sz w:val="20"/>
-      </w:rPr>
-    </w:lvl>
-    <w:lvl w:ilvl="5" w:tentative="1">
-      <w:start w:val="1"/>
-      <w:numFmt w:val="bullet"/>
-      <w:lvlText w:val=""/>
-      <w:lvlJc w:val="left"/>
-      <w:pPr>
-        <w:tabs>
-          <w:tab w:val="num" w:pos="4320"/>
-        </w:tabs>
-        <w:ind w:left="4320" w:hanging="360"/>
-      </w:pPr>
-      <w:rPr>
-        <w:rFonts w:ascii="Symbol" w:hAnsi="Symbol" w:hint="default"/>
-        <w:sz w:val="20"/>
-      </w:rPr>
-    </w:lvl>
-    <w:lvl w:ilvl="6" w:tentative="1">
-      <w:start w:val="1"/>
-      <w:numFmt w:val="bullet"/>
-      <w:lvlText w:val=""/>
-      <w:lvlJc w:val="left"/>
-      <w:pPr>
-        <w:tabs>
-          <w:tab w:val="num" w:pos="5040"/>
-        </w:tabs>
-        <w:ind w:left="5040" w:hanging="360"/>
-      </w:pPr>
-      <w:rPr>
-        <w:rFonts w:ascii="Symbol" w:hAnsi="Symbol" w:hint="default"/>
-        <w:sz w:val="20"/>
-      </w:rPr>
-    </w:lvl>
-    <w:lvl w:ilvl="7" w:tentative="1">
-      <w:start w:val="1"/>
-      <w:numFmt w:val="bullet"/>
-      <w:lvlText w:val=""/>
-      <w:lvlJc w:val="left"/>
-      <w:pPr>
-        <w:tabs>
-          <w:tab w:val="num" w:pos="5760"/>
-        </w:tabs>
-        <w:ind w:left="5760" w:hanging="360"/>
-      </w:pPr>
-      <w:rPr>
-        <w:rFonts w:ascii="Symbol" w:hAnsi="Symbol" w:hint="default"/>
-        <w:sz w:val="20"/>
-      </w:rPr>
-    </w:lvl>
-    <w:lvl w:ilvl="8" w:tentative="1">
-      <w:start w:val="1"/>
-      <w:numFmt w:val="bullet"/>
-      <w:lvlText w:val=""/>
-      <w:lvlJc w:val="left"/>
-      <w:pPr>
-        <w:tabs>
-          <w:tab w:val="num" w:pos="6480"/>
-        </w:tabs>
-        <w:ind w:left="6480" w:hanging="360"/>
-      </w:pPr>
-      <w:rPr>
-        <w:rFonts w:ascii="Symbol" w:hAnsi="Symbol" w:hint="default"/>
-        <w:sz w:val="20"/>
-      </w:rPr>
-    </w:lvl>
-  </w:abstractNum>
-  <w:num w:numId="1" w16cid:durableId="1570842858">
+  <w:num w:numId="1" w16cid:durableId="1658264573">
+    <w:abstractNumId w:val="2"/>
+  </w:num>
+  <w:num w:numId="2" w16cid:durableId="850074201">
+    <w:abstractNumId w:val="0"/>
+  </w:num>
+  <w:num w:numId="3" w16cid:durableId="1635525931">
     <w:abstractNumId w:val="1"/>
   </w:num>
-  <w:num w:numId="2" w16cid:durableId="684863865">
-    <w:abstractNumId w:val="0"/>
-  </w:num>
-  <w:num w:numId="3" w16cid:durableId="1844391184">
-    <w:abstractNumId w:val="2"/>
-  </w:num>
-  <w:num w:numId="4" w16cid:durableId="1284190590">
-    <w:abstractNumId w:val="4"/>
-  </w:num>
-  <w:num w:numId="5" w16cid:durableId="139621137">
+  <w:num w:numId="4" w16cid:durableId="214586179">
     <w:abstractNumId w:val="3"/>
   </w:num>
 </w:numbering>
@@ -3551,7 +3770,7 @@
     <w:name w:val="side-block-title"/>
     <w:basedOn w:val="Normal"/>
     <w:pPr>
-      <w:spacing w:before="100" w:beforeAutospacing="1" w:after="45"/>
+      <w:spacing w:before="100" w:beforeAutospacing="1" w:after="38"/>
     </w:pPr>
     <w:rPr>
       <w:b/>
@@ -3567,7 +3786,7 @@
     <w:name w:val="contact-item"/>
     <w:basedOn w:val="Normal"/>
     <w:pPr>
-      <w:spacing w:before="100" w:beforeAutospacing="1" w:after="38"/>
+      <w:spacing w:before="100" w:beforeAutospacing="1" w:after="30"/>
     </w:pPr>
     <w:rPr>
       <w:color w:val="CBD5E1"/>
@@ -3632,7 +3851,7 @@
     <w:name w:val="edu-item"/>
     <w:basedOn w:val="Normal"/>
     <w:pPr>
-      <w:spacing w:before="100" w:beforeAutospacing="1" w:after="68"/>
+      <w:spacing w:before="100" w:beforeAutospacing="1" w:after="53"/>
     </w:pPr>
   </w:style>
   <w:style w:type="paragraph" w:customStyle="1" w:styleId="edu-title">
@@ -3645,8 +3864,8 @@
       <w:b/>
       <w:bCs/>
       <w:color w:val="FFFFFF"/>
-      <w:sz w:val="15"/>
-      <w:szCs w:val="15"/>
+      <w:sz w:val="14"/>
+      <w:szCs w:val="14"/>
     </w:rPr>
   </w:style>
   <w:style w:type="paragraph" w:customStyle="1" w:styleId="edu-sub">
@@ -3659,8 +3878,8 @@
       <w:b/>
       <w:bCs/>
       <w:color w:val="38BDF8"/>
-      <w:sz w:val="14"/>
-      <w:szCs w:val="14"/>
+      <w:sz w:val="13"/>
+      <w:szCs w:val="13"/>
     </w:rPr>
   </w:style>
   <w:style w:type="paragraph" w:customStyle="1" w:styleId="edu-date">
@@ -3685,6 +3904,15 @@
       <w:color w:val="CBD5E1"/>
       <w:sz w:val="13"/>
       <w:szCs w:val="13"/>
+    </w:rPr>
+  </w:style>
+  <w:style w:type="paragraph" w:customStyle="1" w:styleId="course-list">
+    <w:name w:val="course-list"/>
+    <w:basedOn w:val="Normal"/>
+    <w:rPr>
+      <w:color w:val="CBD5E1"/>
+      <w:sz w:val="14"/>
+      <w:szCs w:val="14"/>
     </w:rPr>
   </w:style>
   <w:style w:type="paragraph" w:customStyle="1" w:styleId="main-content">
@@ -3785,7 +4013,7 @@
     <w:name w:val="job-item"/>
     <w:basedOn w:val="Normal"/>
     <w:pPr>
-      <w:spacing w:before="100" w:beforeAutospacing="1" w:after="60"/>
+      <w:spacing w:before="100" w:beforeAutospacing="1" w:after="53"/>
     </w:pPr>
   </w:style>
   <w:style w:type="paragraph" w:customStyle="1" w:styleId="job-role">
@@ -3850,12 +4078,12 @@
     <w:pPr>
       <w:pBdr>
         <w:top w:val="single" w:sz="6" w:space="3" w:color="E2E8F0"/>
-        <w:left w:val="single" w:sz="6" w:space="4" w:color="E2E8F0"/>
+        <w:left w:val="single" w:sz="6" w:space="5" w:color="E2E8F0"/>
         <w:bottom w:val="single" w:sz="6" w:space="3" w:color="E2E8F0"/>
-        <w:right w:val="single" w:sz="6" w:space="4" w:color="E2E8F0"/>
+        <w:right w:val="single" w:sz="6" w:space="5" w:color="E2E8F0"/>
       </w:pBdr>
       <w:shd w:val="clear" w:color="auto" w:fill="F8FAFC"/>
-      <w:spacing w:before="100" w:beforeAutospacing="1" w:after="100" w:afterAutospacing="1"/>
+      <w:spacing w:before="100" w:beforeAutospacing="1" w:after="53"/>
     </w:pPr>
   </w:style>
   <w:style w:type="paragraph" w:customStyle="1" w:styleId="project-title">
@@ -3868,8 +4096,8 @@
       <w:b/>
       <w:bCs/>
       <w:color w:val="0F172A"/>
-      <w:sz w:val="14"/>
-      <w:szCs w:val="14"/>
+      <w:sz w:val="15"/>
+      <w:szCs w:val="15"/>
     </w:rPr>
   </w:style>
   <w:style w:type="paragraph" w:customStyle="1" w:styleId="project-desc">
@@ -3880,8 +4108,8 @@
     </w:pPr>
     <w:rPr>
       <w:color w:val="475569"/>
-      <w:sz w:val="13"/>
-      <w:szCs w:val="13"/>
+      <w:sz w:val="14"/>
+      <w:szCs w:val="14"/>
     </w:rPr>
   </w:style>
   <w:style w:type="character" w:customStyle="1" w:styleId="badge1">

</xml_diff>

<commit_message>
fix(cv): update Node course title to professional backend architecture and remove incidentes y trazas line
</commit_message>
<xml_diff>
--- a/EmerzonPascualCV2026.docx
+++ b/EmerzonPascualCV2026.docx
@@ -7,7 +7,7 @@
       <w:pPr>
         <w:shd w:val="clear" w:color="auto" w:fill="0F172A"/>
         <w:jc w:val="center"/>
-        <w:divId w:val="241574767"/>
+        <w:divId w:val="206839445"/>
         <w:rPr>
           <w:rFonts w:ascii="Segoe UI" w:eastAsia="Times New Roman" w:hAnsi="Segoe UI" w:cs="Segoe UI"/>
           <w:color w:val="F8FAFC"/>
@@ -24,7 +24,7 @@
           <w:szCs w:val="15"/>
         </w:rPr>
         <w:drawing>
-          <wp:inline distT="0" distB="0" distL="0" distR="0" wp14:anchorId="0CB9521E" wp14:editId="3C900E22">
+          <wp:inline distT="0" distB="0" distL="0" distR="0" wp14:anchorId="7C8D2754" wp14:editId="4E2ACBAF">
             <wp:extent cx="1238250" cy="1238250"/>
             <wp:effectExtent l="0" t="0" r="0" b="0"/>
             <wp:docPr id="1" name="Imagen 1" descr="Rony Emerzon Pascual"/>
@@ -76,7 +76,7 @@
     <w:p>
       <w:pPr>
         <w:shd w:val="clear" w:color="auto" w:fill="0F172A"/>
-        <w:divId w:val="1154877360"/>
+        <w:divId w:val="1255557862"/>
         <w:rPr>
           <w:rFonts w:ascii="Segoe UI" w:eastAsia="Times New Roman" w:hAnsi="Segoe UI" w:cs="Segoe UI"/>
           <w:b/>
@@ -105,7 +105,7 @@
     <w:p>
       <w:pPr>
         <w:shd w:val="clear" w:color="auto" w:fill="0F172A"/>
-        <w:divId w:val="1732269885"/>
+        <w:divId w:val="2110158188"/>
         <w:rPr>
           <w:rFonts w:ascii="Segoe UI" w:eastAsia="Times New Roman" w:hAnsi="Segoe UI" w:cs="Segoe UI"/>
           <w:color w:val="CBD5E1"/>
@@ -139,7 +139,7 @@
     <w:p>
       <w:pPr>
         <w:shd w:val="clear" w:color="auto" w:fill="0F172A"/>
-        <w:divId w:val="1345088846"/>
+        <w:divId w:val="1715158807"/>
         <w:rPr>
           <w:rFonts w:ascii="Segoe UI" w:eastAsia="Times New Roman" w:hAnsi="Segoe UI" w:cs="Segoe UI"/>
           <w:color w:val="CBD5E1"/>
@@ -173,7 +173,7 @@
     <w:p>
       <w:pPr>
         <w:shd w:val="clear" w:color="auto" w:fill="0F172A"/>
-        <w:divId w:val="1776899486"/>
+        <w:divId w:val="1648239847"/>
         <w:rPr>
           <w:rFonts w:ascii="Segoe UI" w:eastAsia="Times New Roman" w:hAnsi="Segoe UI" w:cs="Segoe UI"/>
           <w:color w:val="CBD5E1"/>
@@ -207,7 +207,7 @@
     <w:p>
       <w:pPr>
         <w:shd w:val="clear" w:color="auto" w:fill="0F172A"/>
-        <w:divId w:val="1016734187"/>
+        <w:divId w:val="1463385046"/>
         <w:rPr>
           <w:rFonts w:ascii="Segoe UI" w:eastAsia="Times New Roman" w:hAnsi="Segoe UI" w:cs="Segoe UI"/>
           <w:color w:val="CBD5E1"/>
@@ -243,7 +243,7 @@
     <w:p>
       <w:pPr>
         <w:shd w:val="clear" w:color="auto" w:fill="0F172A"/>
-        <w:divId w:val="966740782"/>
+        <w:divId w:val="2081907829"/>
         <w:rPr>
           <w:rFonts w:ascii="Segoe UI" w:eastAsia="Times New Roman" w:hAnsi="Segoe UI" w:cs="Segoe UI"/>
           <w:color w:val="CBD5E1"/>
@@ -279,7 +279,7 @@
     <w:p>
       <w:pPr>
         <w:shd w:val="clear" w:color="auto" w:fill="0F172A"/>
-        <w:divId w:val="729305031"/>
+        <w:divId w:val="1393118629"/>
         <w:rPr>
           <w:rFonts w:ascii="Segoe UI" w:eastAsia="Times New Roman" w:hAnsi="Segoe UI" w:cs="Segoe UI"/>
           <w:b/>
@@ -308,7 +308,7 @@
     <w:p>
       <w:pPr>
         <w:shd w:val="clear" w:color="auto" w:fill="0F172A"/>
-        <w:divId w:val="806044709"/>
+        <w:divId w:val="1435636419"/>
         <w:rPr>
           <w:rFonts w:ascii="Segoe UI" w:eastAsia="Times New Roman" w:hAnsi="Segoe UI" w:cs="Segoe UI"/>
           <w:color w:val="F8FAFC"/>
@@ -576,7 +576,7 @@
     <w:p>
       <w:pPr>
         <w:shd w:val="clear" w:color="auto" w:fill="0F172A"/>
-        <w:divId w:val="595986093"/>
+        <w:divId w:val="1993023860"/>
         <w:rPr>
           <w:rFonts w:ascii="Segoe UI" w:eastAsia="Times New Roman" w:hAnsi="Segoe UI" w:cs="Segoe UI"/>
           <w:b/>
@@ -610,7 +610,7 @@
         </w:numPr>
         <w:shd w:val="clear" w:color="auto" w:fill="0F172A"/>
         <w:spacing w:before="100" w:beforeAutospacing="1" w:after="27"/>
-        <w:divId w:val="1553076001"/>
+        <w:divId w:val="892425707"/>
         <w:rPr>
           <w:rFonts w:ascii="Segoe UI" w:eastAsia="Times New Roman" w:hAnsi="Segoe UI" w:cs="Segoe UI"/>
           <w:color w:val="CBD5E1"/>
@@ -656,7 +656,7 @@
         </w:numPr>
         <w:shd w:val="clear" w:color="auto" w:fill="0F172A"/>
         <w:spacing w:before="100" w:beforeAutospacing="1" w:after="27"/>
-        <w:divId w:val="1553076001"/>
+        <w:divId w:val="892425707"/>
         <w:rPr>
           <w:rFonts w:ascii="Segoe UI" w:eastAsia="Times New Roman" w:hAnsi="Segoe UI" w:cs="Segoe UI"/>
           <w:color w:val="CBD5E1"/>
@@ -693,7 +693,7 @@
         </w:numPr>
         <w:shd w:val="clear" w:color="auto" w:fill="0F172A"/>
         <w:spacing w:before="100" w:beforeAutospacing="1" w:after="27"/>
-        <w:divId w:val="1553076001"/>
+        <w:divId w:val="892425707"/>
         <w:rPr>
           <w:rFonts w:ascii="Segoe UI" w:eastAsia="Times New Roman" w:hAnsi="Segoe UI" w:cs="Segoe UI"/>
           <w:color w:val="CBD5E1"/>
@@ -730,7 +730,7 @@
         </w:numPr>
         <w:shd w:val="clear" w:color="auto" w:fill="0F172A"/>
         <w:spacing w:before="100" w:beforeAutospacing="1" w:after="27"/>
-        <w:divId w:val="1553076001"/>
+        <w:divId w:val="892425707"/>
         <w:rPr>
           <w:rFonts w:ascii="Segoe UI" w:eastAsia="Times New Roman" w:hAnsi="Segoe UI" w:cs="Segoe UI"/>
           <w:color w:val="CBD5E1"/>
@@ -767,7 +767,7 @@
         </w:numPr>
         <w:shd w:val="clear" w:color="auto" w:fill="0F172A"/>
         <w:spacing w:before="100" w:beforeAutospacing="1" w:after="27"/>
-        <w:divId w:val="1553076001"/>
+        <w:divId w:val="892425707"/>
         <w:rPr>
           <w:rFonts w:ascii="Segoe UI" w:eastAsia="Times New Roman" w:hAnsi="Segoe UI" w:cs="Segoe UI"/>
           <w:color w:val="CBD5E1"/>
@@ -804,7 +804,7 @@
         </w:numPr>
         <w:shd w:val="clear" w:color="auto" w:fill="0F172A"/>
         <w:spacing w:before="100" w:beforeAutospacing="1" w:after="27"/>
-        <w:divId w:val="1553076001"/>
+        <w:divId w:val="892425707"/>
         <w:rPr>
           <w:rFonts w:ascii="Segoe UI" w:eastAsia="Times New Roman" w:hAnsi="Segoe UI" w:cs="Segoe UI"/>
           <w:color w:val="CBD5E1"/>
@@ -841,7 +841,7 @@
         </w:numPr>
         <w:shd w:val="clear" w:color="auto" w:fill="0F172A"/>
         <w:spacing w:before="100" w:beforeAutospacing="1" w:after="27"/>
-        <w:divId w:val="1553076001"/>
+        <w:divId w:val="892425707"/>
         <w:rPr>
           <w:rFonts w:ascii="Segoe UI" w:eastAsia="Times New Roman" w:hAnsi="Segoe UI" w:cs="Segoe UI"/>
           <w:color w:val="CBD5E1"/>
@@ -878,7 +878,7 @@
         </w:numPr>
         <w:shd w:val="clear" w:color="auto" w:fill="0F172A"/>
         <w:spacing w:before="100" w:beforeAutospacing="1" w:after="27"/>
-        <w:divId w:val="1553076001"/>
+        <w:divId w:val="892425707"/>
         <w:rPr>
           <w:rFonts w:ascii="Segoe UI" w:eastAsia="Times New Roman" w:hAnsi="Segoe UI" w:cs="Segoe UI"/>
           <w:color w:val="CBD5E1"/>
@@ -910,7 +910,7 @@
     <w:p>
       <w:pPr>
         <w:shd w:val="clear" w:color="auto" w:fill="0F172A"/>
-        <w:divId w:val="1593273160"/>
+        <w:divId w:val="1277325274"/>
         <w:rPr>
           <w:rFonts w:ascii="Segoe UI" w:eastAsia="Times New Roman" w:hAnsi="Segoe UI" w:cs="Segoe UI"/>
           <w:b/>
@@ -939,7 +939,7 @@
     <w:p>
       <w:pPr>
         <w:shd w:val="clear" w:color="auto" w:fill="0F172A"/>
-        <w:divId w:val="1149446106"/>
+        <w:divId w:val="347368097"/>
         <w:rPr>
           <w:rFonts w:ascii="Segoe UI" w:eastAsia="Times New Roman" w:hAnsi="Segoe UI" w:cs="Segoe UI"/>
           <w:b/>
@@ -964,7 +964,7 @@
     <w:p>
       <w:pPr>
         <w:shd w:val="clear" w:color="auto" w:fill="0F172A"/>
-        <w:divId w:val="1498500077"/>
+        <w:divId w:val="1195073956"/>
         <w:rPr>
           <w:rFonts w:ascii="Segoe UI" w:eastAsia="Times New Roman" w:hAnsi="Segoe UI" w:cs="Segoe UI"/>
           <w:b/>
@@ -989,7 +989,7 @@
     <w:p>
       <w:pPr>
         <w:shd w:val="clear" w:color="auto" w:fill="0F172A"/>
-        <w:divId w:val="1673072263"/>
+        <w:divId w:val="2073850102"/>
         <w:rPr>
           <w:rFonts w:ascii="Segoe UI" w:eastAsia="Times New Roman" w:hAnsi="Segoe UI" w:cs="Segoe UI"/>
           <w:color w:val="94A3B8"/>
@@ -1010,7 +1010,7 @@
     <w:p>
       <w:pPr>
         <w:shd w:val="clear" w:color="auto" w:fill="0F172A"/>
-        <w:divId w:val="1791557980"/>
+        <w:divId w:val="1180655169"/>
         <w:rPr>
           <w:rFonts w:ascii="Segoe UI" w:eastAsia="Times New Roman" w:hAnsi="Segoe UI" w:cs="Segoe UI"/>
           <w:color w:val="CBD5E1"/>
@@ -1031,7 +1031,7 @@
     <w:p>
       <w:pPr>
         <w:shd w:val="clear" w:color="auto" w:fill="0F172A"/>
-        <w:divId w:val="2081754990"/>
+        <w:divId w:val="756637630"/>
         <w:rPr>
           <w:rFonts w:ascii="Segoe UI" w:eastAsia="Times New Roman" w:hAnsi="Segoe UI" w:cs="Segoe UI"/>
           <w:b/>
@@ -1056,7 +1056,7 @@
     <w:p>
       <w:pPr>
         <w:shd w:val="clear" w:color="auto" w:fill="0F172A"/>
-        <w:divId w:val="2118676867"/>
+        <w:divId w:val="405688955"/>
         <w:rPr>
           <w:rFonts w:ascii="Segoe UI" w:eastAsia="Times New Roman" w:hAnsi="Segoe UI" w:cs="Segoe UI"/>
           <w:b/>
@@ -1081,7 +1081,7 @@
     <w:p>
       <w:pPr>
         <w:shd w:val="clear" w:color="auto" w:fill="0F172A"/>
-        <w:divId w:val="1630361655"/>
+        <w:divId w:val="1777408327"/>
         <w:rPr>
           <w:rFonts w:ascii="Segoe UI" w:eastAsia="Times New Roman" w:hAnsi="Segoe UI" w:cs="Segoe UI"/>
           <w:color w:val="CBD5E1"/>
@@ -1102,7 +1102,7 @@
     <w:p>
       <w:pPr>
         <w:shd w:val="clear" w:color="auto" w:fill="0F172A"/>
-        <w:divId w:val="1808164588"/>
+        <w:divId w:val="661465483"/>
         <w:rPr>
           <w:rFonts w:ascii="Segoe UI" w:eastAsia="Times New Roman" w:hAnsi="Segoe UI" w:cs="Segoe UI"/>
           <w:b/>
@@ -1121,13 +1121,13 @@
           <w:sz w:val="14"/>
           <w:szCs w:val="14"/>
         </w:rPr>
-        <w:t>Desarrollo Backend Node.js &amp; AWS</w:t>
+        <w:t>Arquitectura Backend Node.js &amp; Cloud AWS</w:t>
       </w:r>
     </w:p>
     <w:p>
       <w:pPr>
         <w:shd w:val="clear" w:color="auto" w:fill="0F172A"/>
-        <w:divId w:val="267860279"/>
+        <w:divId w:val="1394891112"/>
         <w:rPr>
           <w:rFonts w:ascii="Segoe UI" w:eastAsia="Times New Roman" w:hAnsi="Segoe UI" w:cs="Segoe UI"/>
           <w:b/>
@@ -1152,7 +1152,7 @@
     <w:p>
       <w:pPr>
         <w:shd w:val="clear" w:color="auto" w:fill="0F172A"/>
-        <w:divId w:val="74327980"/>
+        <w:divId w:val="312875150"/>
         <w:rPr>
           <w:rFonts w:ascii="Segoe UI" w:eastAsia="Times New Roman" w:hAnsi="Segoe UI" w:cs="Segoe UI"/>
           <w:color w:val="CBD5E1"/>
@@ -1167,13 +1167,13 @@
           <w:sz w:val="13"/>
           <w:szCs w:val="13"/>
         </w:rPr>
-        <w:t>Express.js, AWS (Lambda, S3, CloudWatch), incidentes y trazas.</w:t>
+        <w:t>Express.js, REST APIs, AWS (Lambda, S3, CloudWatch) &amp; Serverless.</w:t>
       </w:r>
     </w:p>
     <w:p>
       <w:pPr>
         <w:shd w:val="clear" w:color="auto" w:fill="0F172A"/>
-        <w:divId w:val="1559592848"/>
+        <w:divId w:val="1110395951"/>
         <w:rPr>
           <w:rFonts w:ascii="Segoe UI" w:eastAsia="Times New Roman" w:hAnsi="Segoe UI" w:cs="Segoe UI"/>
           <w:b/>
@@ -1198,7 +1198,7 @@
     <w:p>
       <w:pPr>
         <w:shd w:val="clear" w:color="auto" w:fill="0F172A"/>
-        <w:divId w:val="1772431846"/>
+        <w:divId w:val="952513383"/>
         <w:rPr>
           <w:rFonts w:ascii="Segoe UI" w:eastAsia="Times New Roman" w:hAnsi="Segoe UI" w:cs="Segoe UI"/>
           <w:b/>
@@ -1223,7 +1223,7 @@
     <w:p>
       <w:pPr>
         <w:shd w:val="clear" w:color="auto" w:fill="0F172A"/>
-        <w:divId w:val="220219324"/>
+        <w:divId w:val="924800147"/>
         <w:rPr>
           <w:rFonts w:ascii="Segoe UI" w:eastAsia="Times New Roman" w:hAnsi="Segoe UI" w:cs="Segoe UI"/>
           <w:b/>
@@ -1252,7 +1252,7 @@
     <w:p>
       <w:pPr>
         <w:shd w:val="clear" w:color="auto" w:fill="0F172A"/>
-        <w:divId w:val="534780683"/>
+        <w:divId w:val="979724990"/>
         <w:rPr>
           <w:rFonts w:ascii="Segoe UI" w:eastAsia="Times New Roman" w:hAnsi="Segoe UI" w:cs="Segoe UI"/>
           <w:color w:val="CBD5E1"/>
@@ -1286,7 +1286,7 @@
     <w:p>
       <w:pPr>
         <w:shd w:val="clear" w:color="auto" w:fill="0F172A"/>
-        <w:divId w:val="297686796"/>
+        <w:divId w:val="896088499"/>
         <w:rPr>
           <w:rFonts w:ascii="Segoe UI" w:eastAsia="Times New Roman" w:hAnsi="Segoe UI" w:cs="Segoe UI"/>
           <w:color w:val="CBD5E1"/>
@@ -1321,7 +1321,7 @@
       <w:pPr>
         <w:pStyle w:val="Ttulo1"/>
         <w:shd w:val="clear" w:color="auto" w:fill="FFFFFF"/>
-        <w:divId w:val="540821454"/>
+        <w:divId w:val="335772619"/>
         <w:rPr>
           <w:rFonts w:ascii="Segoe UI" w:eastAsia="Times New Roman" w:hAnsi="Segoe UI" w:cs="Segoe UI"/>
           <w:color w:val="0F172A"/>
@@ -1344,7 +1344,7 @@
     <w:p>
       <w:pPr>
         <w:shd w:val="clear" w:color="auto" w:fill="FFFFFF"/>
-        <w:divId w:val="1935240515"/>
+        <w:divId w:val="1348292686"/>
         <w:rPr>
           <w:rFonts w:ascii="Segoe UI" w:eastAsia="Times New Roman" w:hAnsi="Segoe UI" w:cs="Segoe UI"/>
           <w:b/>
@@ -1373,7 +1373,7 @@
     <w:p>
       <w:pPr>
         <w:shd w:val="clear" w:color="auto" w:fill="FFFFFF"/>
-        <w:divId w:val="1397781449"/>
+        <w:divId w:val="1523201915"/>
         <w:rPr>
           <w:rFonts w:ascii="Segoe UI" w:eastAsia="Times New Roman" w:hAnsi="Segoe UI" w:cs="Segoe UI"/>
           <w:b/>
@@ -1398,7 +1398,7 @@
     <w:p>
       <w:pPr>
         <w:shd w:val="clear" w:color="auto" w:fill="FFFFFF"/>
-        <w:divId w:val="1203900767"/>
+        <w:divId w:val="1221862305"/>
         <w:rPr>
           <w:rFonts w:ascii="Segoe UI" w:eastAsia="Times New Roman" w:hAnsi="Segoe UI" w:cs="Segoe UI"/>
           <w:b/>
@@ -1428,7 +1428,7 @@
       <w:pPr>
         <w:pStyle w:val="profile-summary"/>
         <w:shd w:val="clear" w:color="auto" w:fill="FFFFFF"/>
-        <w:divId w:val="1910925164"/>
+        <w:divId w:val="2049377385"/>
         <w:rPr>
           <w:rFonts w:ascii="Segoe UI" w:hAnsi="Segoe UI" w:cs="Segoe UI"/>
         </w:rPr>
@@ -1593,7 +1593,7 @@
     <w:p>
       <w:pPr>
         <w:shd w:val="clear" w:color="auto" w:fill="FFFFFF"/>
-        <w:divId w:val="1255893550"/>
+        <w:divId w:val="894703075"/>
         <w:rPr>
           <w:rFonts w:ascii="Segoe UI" w:eastAsia="Times New Roman" w:hAnsi="Segoe UI" w:cs="Segoe UI"/>
           <w:b/>
@@ -1622,7 +1622,7 @@
     <w:p>
       <w:pPr>
         <w:shd w:val="clear" w:color="auto" w:fill="FFFFFF"/>
-        <w:divId w:val="303894010"/>
+        <w:divId w:val="693387276"/>
         <w:rPr>
           <w:rFonts w:ascii="Segoe UI" w:eastAsia="Times New Roman" w:hAnsi="Segoe UI" w:cs="Segoe UI"/>
           <w:color w:val="1E293B"/>
@@ -1666,7 +1666,7 @@
     <w:p>
       <w:pPr>
         <w:shd w:val="clear" w:color="auto" w:fill="FFFFFF"/>
-        <w:divId w:val="1004481086"/>
+        <w:divId w:val="825164938"/>
         <w:rPr>
           <w:rFonts w:ascii="Segoe UI" w:eastAsia="Times New Roman" w:hAnsi="Segoe UI" w:cs="Segoe UI"/>
           <w:color w:val="1E293B"/>
@@ -1700,7 +1700,7 @@
         <w:shd w:val="clear" w:color="auto" w:fill="FFFFFF"/>
         <w:spacing w:before="100" w:beforeAutospacing="1" w:after="15"/>
         <w:ind w:left="870"/>
-        <w:divId w:val="1823500948"/>
+        <w:divId w:val="516575397"/>
         <w:rPr>
           <w:rFonts w:ascii="Segoe UI" w:eastAsia="Times New Roman" w:hAnsi="Segoe UI" w:cs="Segoe UI"/>
           <w:color w:val="334155"/>
@@ -1779,7 +1779,7 @@
         <w:shd w:val="clear" w:color="auto" w:fill="FFFFFF"/>
         <w:spacing w:before="100" w:beforeAutospacing="1" w:after="15"/>
         <w:ind w:left="870"/>
-        <w:divId w:val="1823500948"/>
+        <w:divId w:val="516575397"/>
         <w:rPr>
           <w:rFonts w:ascii="Segoe UI" w:eastAsia="Times New Roman" w:hAnsi="Segoe UI" w:cs="Segoe UI"/>
           <w:color w:val="334155"/>
@@ -1837,7 +1837,7 @@
         <w:shd w:val="clear" w:color="auto" w:fill="FFFFFF"/>
         <w:spacing w:before="100" w:beforeAutospacing="1" w:after="15"/>
         <w:ind w:left="870"/>
-        <w:divId w:val="1823500948"/>
+        <w:divId w:val="516575397"/>
         <w:rPr>
           <w:rFonts w:ascii="Segoe UI" w:eastAsia="Times New Roman" w:hAnsi="Segoe UI" w:cs="Segoe UI"/>
           <w:color w:val="334155"/>
@@ -1875,7 +1875,7 @@
         <w:shd w:val="clear" w:color="auto" w:fill="FFFFFF"/>
         <w:spacing w:before="100" w:beforeAutospacing="1" w:after="15"/>
         <w:ind w:left="870"/>
-        <w:divId w:val="1823500948"/>
+        <w:divId w:val="516575397"/>
         <w:rPr>
           <w:rFonts w:ascii="Segoe UI" w:eastAsia="Times New Roman" w:hAnsi="Segoe UI" w:cs="Segoe UI"/>
           <w:color w:val="334155"/>
@@ -1973,7 +1973,7 @@
         <w:shd w:val="clear" w:color="auto" w:fill="FFFFFF"/>
         <w:spacing w:before="100" w:beforeAutospacing="1" w:after="15"/>
         <w:ind w:left="870"/>
-        <w:divId w:val="1823500948"/>
+        <w:divId w:val="516575397"/>
         <w:rPr>
           <w:rFonts w:ascii="Segoe UI" w:eastAsia="Times New Roman" w:hAnsi="Segoe UI" w:cs="Segoe UI"/>
           <w:color w:val="334155"/>
@@ -2014,7 +2014,7 @@
     <w:p>
       <w:pPr>
         <w:shd w:val="clear" w:color="auto" w:fill="FFFFFF"/>
-        <w:divId w:val="1397390064"/>
+        <w:divId w:val="1868761050"/>
         <w:rPr>
           <w:rFonts w:ascii="Segoe UI" w:eastAsia="Times New Roman" w:hAnsi="Segoe UI" w:cs="Segoe UI"/>
           <w:color w:val="1E293B"/>
@@ -2058,7 +2058,7 @@
     <w:p>
       <w:pPr>
         <w:shd w:val="clear" w:color="auto" w:fill="FFFFFF"/>
-        <w:divId w:val="1938520590"/>
+        <w:divId w:val="840118623"/>
         <w:rPr>
           <w:rFonts w:ascii="Segoe UI" w:eastAsia="Times New Roman" w:hAnsi="Segoe UI" w:cs="Segoe UI"/>
           <w:color w:val="1E293B"/>
@@ -2092,7 +2092,7 @@
         <w:shd w:val="clear" w:color="auto" w:fill="FFFFFF"/>
         <w:spacing w:before="100" w:beforeAutospacing="1" w:after="15"/>
         <w:ind w:left="870"/>
-        <w:divId w:val="418209489"/>
+        <w:divId w:val="892614824"/>
         <w:rPr>
           <w:rFonts w:ascii="Segoe UI" w:eastAsia="Times New Roman" w:hAnsi="Segoe UI" w:cs="Segoe UI"/>
           <w:color w:val="334155"/>
@@ -2113,7 +2113,7 @@
     <w:p>
       <w:pPr>
         <w:shd w:val="clear" w:color="auto" w:fill="FFFFFF"/>
-        <w:divId w:val="558781800"/>
+        <w:divId w:val="730160014"/>
         <w:rPr>
           <w:rFonts w:ascii="Segoe UI" w:eastAsia="Times New Roman" w:hAnsi="Segoe UI" w:cs="Segoe UI"/>
           <w:color w:val="1E293B"/>
@@ -2157,7 +2157,7 @@
     <w:p>
       <w:pPr>
         <w:shd w:val="clear" w:color="auto" w:fill="FFFFFF"/>
-        <w:divId w:val="428699374"/>
+        <w:divId w:val="2128818247"/>
         <w:rPr>
           <w:rFonts w:ascii="Segoe UI" w:eastAsia="Times New Roman" w:hAnsi="Segoe UI" w:cs="Segoe UI"/>
           <w:color w:val="1E293B"/>
@@ -2191,7 +2191,7 @@
         <w:shd w:val="clear" w:color="auto" w:fill="FFFFFF"/>
         <w:spacing w:before="100" w:beforeAutospacing="1" w:after="15"/>
         <w:ind w:left="870"/>
-        <w:divId w:val="2140222940"/>
+        <w:divId w:val="829832000"/>
         <w:rPr>
           <w:rFonts w:ascii="Segoe UI" w:eastAsia="Times New Roman" w:hAnsi="Segoe UI" w:cs="Segoe UI"/>
           <w:color w:val="334155"/>
@@ -2212,7 +2212,7 @@
     <w:p>
       <w:pPr>
         <w:shd w:val="clear" w:color="auto" w:fill="FFFFFF"/>
-        <w:divId w:val="1290626302"/>
+        <w:divId w:val="1042366662"/>
         <w:rPr>
           <w:rFonts w:ascii="Segoe UI" w:eastAsia="Times New Roman" w:hAnsi="Segoe UI" w:cs="Segoe UI"/>
           <w:b/>
@@ -2241,7 +2241,7 @@
     <w:p>
       <w:pPr>
         <w:shd w:val="clear" w:color="auto" w:fill="F8FAFC"/>
-        <w:divId w:val="104622824"/>
+        <w:divId w:val="70927925"/>
         <w:rPr>
           <w:rFonts w:ascii="Segoe UI" w:eastAsia="Times New Roman" w:hAnsi="Segoe UI" w:cs="Segoe UI"/>
           <w:b/>
@@ -2266,7 +2266,7 @@
     <w:p>
       <w:pPr>
         <w:shd w:val="clear" w:color="auto" w:fill="F8FAFC"/>
-        <w:divId w:val="19479145"/>
+        <w:divId w:val="1836798286"/>
         <w:rPr>
           <w:rFonts w:ascii="Segoe UI" w:eastAsia="Times New Roman" w:hAnsi="Segoe UI" w:cs="Segoe UI"/>
           <w:color w:val="475569"/>
@@ -2344,7 +2344,7 @@
     <w:p>
       <w:pPr>
         <w:shd w:val="clear" w:color="auto" w:fill="F8FAFC"/>
-        <w:divId w:val="1794471580"/>
+        <w:divId w:val="1255866895"/>
         <w:rPr>
           <w:rFonts w:ascii="Segoe UI" w:eastAsia="Times New Roman" w:hAnsi="Segoe UI" w:cs="Segoe UI"/>
           <w:b/>
@@ -2369,7 +2369,7 @@
     <w:p>
       <w:pPr>
         <w:shd w:val="clear" w:color="auto" w:fill="F8FAFC"/>
-        <w:divId w:val="1873304864"/>
+        <w:divId w:val="35785063"/>
         <w:rPr>
           <w:rFonts w:ascii="Segoe UI" w:eastAsia="Times New Roman" w:hAnsi="Segoe UI" w:cs="Segoe UI"/>
           <w:color w:val="475569"/>
@@ -2447,7 +2447,7 @@
     <w:p>
       <w:pPr>
         <w:shd w:val="clear" w:color="auto" w:fill="F8FAFC"/>
-        <w:divId w:val="597059049"/>
+        <w:divId w:val="2050059301"/>
         <w:rPr>
           <w:rFonts w:ascii="Segoe UI" w:eastAsia="Times New Roman" w:hAnsi="Segoe UI" w:cs="Segoe UI"/>
           <w:b/>
@@ -2472,7 +2472,7 @@
     <w:p>
       <w:pPr>
         <w:shd w:val="clear" w:color="auto" w:fill="F8FAFC"/>
-        <w:divId w:val="1259485929"/>
+        <w:divId w:val="47996921"/>
         <w:rPr>
           <w:rFonts w:ascii="Segoe UI" w:eastAsia="Times New Roman" w:hAnsi="Segoe UI" w:cs="Segoe UI"/>
           <w:color w:val="475569"/>
@@ -2521,7 +2521,7 @@
     <w:p>
       <w:pPr>
         <w:shd w:val="clear" w:color="auto" w:fill="F8FAFC"/>
-        <w:divId w:val="303777219"/>
+        <w:divId w:val="2033679182"/>
         <w:rPr>
           <w:rFonts w:ascii="Segoe UI" w:eastAsia="Times New Roman" w:hAnsi="Segoe UI" w:cs="Segoe UI"/>
           <w:b/>
@@ -2546,7 +2546,7 @@
     <w:p>
       <w:pPr>
         <w:shd w:val="clear" w:color="auto" w:fill="F8FAFC"/>
-        <w:divId w:val="1931311014"/>
+        <w:divId w:val="68503678"/>
         <w:rPr>
           <w:rFonts w:ascii="Segoe UI" w:eastAsia="Times New Roman" w:hAnsi="Segoe UI" w:cs="Segoe UI"/>
           <w:color w:val="475569"/>
@@ -2634,9 +2634,9 @@
 <file path=word/numbering.xml><?xml version="1.0" encoding="utf-8"?>
 <w:numbering xmlns:wpc="http://schemas.microsoft.com/office/word/2010/wordprocessingCanvas" xmlns:cx="http://schemas.microsoft.com/office/drawing/2014/chartex" xmlns:cx1="http://schemas.microsoft.com/office/drawing/2015/9/8/chartex" xmlns:cx2="http://schemas.microsoft.com/office/drawing/2015/10/21/chartex" xmlns:cx3="http://schemas.microsoft.com/office/drawing/2016/5/9/chartex" xmlns:cx4="http://schemas.microsoft.com/office/drawing/2016/5/10/chartex" xmlns:cx5="http://schemas.microsoft.com/office/drawing/2016/5/11/chartex" xmlns:cx6="http://schemas.microsoft.com/office/drawing/2016/5/12/chartex" xmlns:cx7="http://schemas.microsoft.com/office/drawing/2016/5/13/chartex" xmlns:cx8="http://schemas.microsoft.com/office/drawing/2016/5/14/chartex" xmlns:mc="http://schemas.openxmlformats.org/markup-compatibility/2006" xmlns:aink="http://schemas.microsoft.com/office/drawing/2016/ink" xmlns:am3d="http://schemas.microsoft.com/office/drawing/2017/model3d" xmlns:o="urn:schemas-microsoft-com:office:office" xmlns:oel="http://schemas.microsoft.com/office/2019/extlst" xmlns:r="http://schemas.openxmlformats.org/officeDocument/2006/relationships" xmlns:m="http://schemas.openxmlformats.org/officeDocument/2006/math" xmlns:v="urn:schemas-microsoft-com:vml" xmlns:wp14="http://schemas.microsoft.com/office/word/2010/wordprocessingDrawing" xmlns:wp="http://schemas.openxmlformats.org/drawingml/2006/wordprocessingDrawing" xmlns:w10="urn:schemas-microsoft-com:office:word" xmlns:w="http://schemas.openxmlformats.org/wordprocessingml/2006/main" xmlns:w14="http://schemas.microsoft.com/office/word/2010/wordml" xmlns:w15="http://schemas.microsoft.com/office/word/2012/wordml" xmlns:w16cex="http://schemas.microsoft.com/office/word/2018/wordml/cex" xmlns:w16cid="http://schemas.microsoft.com/office/word/2016/wordml/cid" xmlns:w16="http://schemas.microsoft.com/office/word/2018/wordml" xmlns:w16sdtdh="http://schemas.microsoft.com/office/word/2020/wordml/sdtdatahash" xmlns:w16se="http://schemas.microsoft.com/office/word/2015/wordml/symex" xmlns:wpg="http://schemas.microsoft.com/office/word/2010/wordprocessingGroup" xmlns:wpi="http://schemas.microsoft.com/office/word/2010/wordprocessingInk" xmlns:wne="http://schemas.microsoft.com/office/word/2006/wordml" xmlns:wps="http://schemas.microsoft.com/office/word/2010/wordprocessingShape" mc:Ignorable="w14 w15 w16se w16cid w16 w16cex w16sdtdh wp14">
   <w:abstractNum w:abstractNumId="0" w15:restartNumberingAfterBreak="0">
-    <w:nsid w:val="1604523F"/>
+    <w:nsid w:val="1C2911C8"/>
     <w:multiLevelType w:val="multilevel"/>
-    <w:tmpl w:val="E7FC66E2"/>
+    <w:tmpl w:val="CC346EAC"/>
     <w:lvl w:ilvl="0">
       <w:start w:val="1"/>
       <w:numFmt w:val="bullet"/>
@@ -2783,9 +2783,9 @@
     </w:lvl>
   </w:abstractNum>
   <w:abstractNum w:abstractNumId="1" w15:restartNumberingAfterBreak="0">
-    <w:nsid w:val="27BF0049"/>
+    <w:nsid w:val="2B89683A"/>
     <w:multiLevelType w:val="multilevel"/>
-    <w:tmpl w:val="4C3048DE"/>
+    <w:tmpl w:val="AD34278A"/>
     <w:lvl w:ilvl="0">
       <w:start w:val="1"/>
       <w:numFmt w:val="bullet"/>
@@ -2932,9 +2932,158 @@
     </w:lvl>
   </w:abstractNum>
   <w:abstractNum w:abstractNumId="2" w15:restartNumberingAfterBreak="0">
-    <w:nsid w:val="32397982"/>
+    <w:nsid w:val="357C08B3"/>
     <w:multiLevelType w:val="multilevel"/>
-    <w:tmpl w:val="64E29B0C"/>
+    <w:tmpl w:val="C7B039A0"/>
+    <w:lvl w:ilvl="0">
+      <w:start w:val="1"/>
+      <w:numFmt w:val="bullet"/>
+      <w:lvlText w:val=""/>
+      <w:lvlJc w:val="left"/>
+      <w:pPr>
+        <w:tabs>
+          <w:tab w:val="num" w:pos="720"/>
+        </w:tabs>
+        <w:ind w:left="720" w:hanging="360"/>
+      </w:pPr>
+      <w:rPr>
+        <w:rFonts w:ascii="Symbol" w:hAnsi="Symbol" w:hint="default"/>
+        <w:sz w:val="20"/>
+      </w:rPr>
+    </w:lvl>
+    <w:lvl w:ilvl="1" w:tentative="1">
+      <w:start w:val="1"/>
+      <w:numFmt w:val="bullet"/>
+      <w:lvlText w:val=""/>
+      <w:lvlJc w:val="left"/>
+      <w:pPr>
+        <w:tabs>
+          <w:tab w:val="num" w:pos="1440"/>
+        </w:tabs>
+        <w:ind w:left="1440" w:hanging="360"/>
+      </w:pPr>
+      <w:rPr>
+        <w:rFonts w:ascii="Symbol" w:hAnsi="Symbol" w:hint="default"/>
+        <w:sz w:val="20"/>
+      </w:rPr>
+    </w:lvl>
+    <w:lvl w:ilvl="2" w:tentative="1">
+      <w:start w:val="1"/>
+      <w:numFmt w:val="bullet"/>
+      <w:lvlText w:val=""/>
+      <w:lvlJc w:val="left"/>
+      <w:pPr>
+        <w:tabs>
+          <w:tab w:val="num" w:pos="2160"/>
+        </w:tabs>
+        <w:ind w:left="2160" w:hanging="360"/>
+      </w:pPr>
+      <w:rPr>
+        <w:rFonts w:ascii="Symbol" w:hAnsi="Symbol" w:hint="default"/>
+        <w:sz w:val="20"/>
+      </w:rPr>
+    </w:lvl>
+    <w:lvl w:ilvl="3" w:tentative="1">
+      <w:start w:val="1"/>
+      <w:numFmt w:val="bullet"/>
+      <w:lvlText w:val=""/>
+      <w:lvlJc w:val="left"/>
+      <w:pPr>
+        <w:tabs>
+          <w:tab w:val="num" w:pos="2880"/>
+        </w:tabs>
+        <w:ind w:left="2880" w:hanging="360"/>
+      </w:pPr>
+      <w:rPr>
+        <w:rFonts w:ascii="Symbol" w:hAnsi="Symbol" w:hint="default"/>
+        <w:sz w:val="20"/>
+      </w:rPr>
+    </w:lvl>
+    <w:lvl w:ilvl="4" w:tentative="1">
+      <w:start w:val="1"/>
+      <w:numFmt w:val="bullet"/>
+      <w:lvlText w:val=""/>
+      <w:lvlJc w:val="left"/>
+      <w:pPr>
+        <w:tabs>
+          <w:tab w:val="num" w:pos="3600"/>
+        </w:tabs>
+        <w:ind w:left="3600" w:hanging="360"/>
+      </w:pPr>
+      <w:rPr>
+        <w:rFonts w:ascii="Symbol" w:hAnsi="Symbol" w:hint="default"/>
+        <w:sz w:val="20"/>
+      </w:rPr>
+    </w:lvl>
+    <w:lvl w:ilvl="5" w:tentative="1">
+      <w:start w:val="1"/>
+      <w:numFmt w:val="bullet"/>
+      <w:lvlText w:val=""/>
+      <w:lvlJc w:val="left"/>
+      <w:pPr>
+        <w:tabs>
+          <w:tab w:val="num" w:pos="4320"/>
+        </w:tabs>
+        <w:ind w:left="4320" w:hanging="360"/>
+      </w:pPr>
+      <w:rPr>
+        <w:rFonts w:ascii="Symbol" w:hAnsi="Symbol" w:hint="default"/>
+        <w:sz w:val="20"/>
+      </w:rPr>
+    </w:lvl>
+    <w:lvl w:ilvl="6" w:tentative="1">
+      <w:start w:val="1"/>
+      <w:numFmt w:val="bullet"/>
+      <w:lvlText w:val=""/>
+      <w:lvlJc w:val="left"/>
+      <w:pPr>
+        <w:tabs>
+          <w:tab w:val="num" w:pos="5040"/>
+        </w:tabs>
+        <w:ind w:left="5040" w:hanging="360"/>
+      </w:pPr>
+      <w:rPr>
+        <w:rFonts w:ascii="Symbol" w:hAnsi="Symbol" w:hint="default"/>
+        <w:sz w:val="20"/>
+      </w:rPr>
+    </w:lvl>
+    <w:lvl w:ilvl="7" w:tentative="1">
+      <w:start w:val="1"/>
+      <w:numFmt w:val="bullet"/>
+      <w:lvlText w:val=""/>
+      <w:lvlJc w:val="left"/>
+      <w:pPr>
+        <w:tabs>
+          <w:tab w:val="num" w:pos="5760"/>
+        </w:tabs>
+        <w:ind w:left="5760" w:hanging="360"/>
+      </w:pPr>
+      <w:rPr>
+        <w:rFonts w:ascii="Symbol" w:hAnsi="Symbol" w:hint="default"/>
+        <w:sz w:val="20"/>
+      </w:rPr>
+    </w:lvl>
+    <w:lvl w:ilvl="8" w:tentative="1">
+      <w:start w:val="1"/>
+      <w:numFmt w:val="bullet"/>
+      <w:lvlText w:val=""/>
+      <w:lvlJc w:val="left"/>
+      <w:pPr>
+        <w:tabs>
+          <w:tab w:val="num" w:pos="6480"/>
+        </w:tabs>
+        <w:ind w:left="6480" w:hanging="360"/>
+      </w:pPr>
+      <w:rPr>
+        <w:rFonts w:ascii="Symbol" w:hAnsi="Symbol" w:hint="default"/>
+        <w:sz w:val="20"/>
+      </w:rPr>
+    </w:lvl>
+  </w:abstractNum>
+  <w:abstractNum w:abstractNumId="3" w15:restartNumberingAfterBreak="0">
+    <w:nsid w:val="78BB792D"/>
+    <w:multiLevelType w:val="multilevel"/>
+    <w:tmpl w:val="E948F0E8"/>
     <w:lvl w:ilvl="0">
       <w:start w:val="1"/>
       <w:numFmt w:val="bullet"/>
@@ -3080,166 +3229,17 @@
       </w:rPr>
     </w:lvl>
   </w:abstractNum>
-  <w:abstractNum w:abstractNumId="3" w15:restartNumberingAfterBreak="0">
-    <w:nsid w:val="5205453B"/>
-    <w:multiLevelType w:val="multilevel"/>
-    <w:tmpl w:val="34CCBC5E"/>
-    <w:lvl w:ilvl="0">
-      <w:start w:val="1"/>
-      <w:numFmt w:val="bullet"/>
-      <w:lvlText w:val=""/>
-      <w:lvlJc w:val="left"/>
-      <w:pPr>
-        <w:tabs>
-          <w:tab w:val="num" w:pos="720"/>
-        </w:tabs>
-        <w:ind w:left="720" w:hanging="360"/>
-      </w:pPr>
-      <w:rPr>
-        <w:rFonts w:ascii="Symbol" w:hAnsi="Symbol" w:hint="default"/>
-        <w:sz w:val="20"/>
-      </w:rPr>
-    </w:lvl>
-    <w:lvl w:ilvl="1" w:tentative="1">
-      <w:start w:val="1"/>
-      <w:numFmt w:val="bullet"/>
-      <w:lvlText w:val=""/>
-      <w:lvlJc w:val="left"/>
-      <w:pPr>
-        <w:tabs>
-          <w:tab w:val="num" w:pos="1440"/>
-        </w:tabs>
-        <w:ind w:left="1440" w:hanging="360"/>
-      </w:pPr>
-      <w:rPr>
-        <w:rFonts w:ascii="Symbol" w:hAnsi="Symbol" w:hint="default"/>
-        <w:sz w:val="20"/>
-      </w:rPr>
-    </w:lvl>
-    <w:lvl w:ilvl="2" w:tentative="1">
-      <w:start w:val="1"/>
-      <w:numFmt w:val="bullet"/>
-      <w:lvlText w:val=""/>
-      <w:lvlJc w:val="left"/>
-      <w:pPr>
-        <w:tabs>
-          <w:tab w:val="num" w:pos="2160"/>
-        </w:tabs>
-        <w:ind w:left="2160" w:hanging="360"/>
-      </w:pPr>
-      <w:rPr>
-        <w:rFonts w:ascii="Symbol" w:hAnsi="Symbol" w:hint="default"/>
-        <w:sz w:val="20"/>
-      </w:rPr>
-    </w:lvl>
-    <w:lvl w:ilvl="3" w:tentative="1">
-      <w:start w:val="1"/>
-      <w:numFmt w:val="bullet"/>
-      <w:lvlText w:val=""/>
-      <w:lvlJc w:val="left"/>
-      <w:pPr>
-        <w:tabs>
-          <w:tab w:val="num" w:pos="2880"/>
-        </w:tabs>
-        <w:ind w:left="2880" w:hanging="360"/>
-      </w:pPr>
-      <w:rPr>
-        <w:rFonts w:ascii="Symbol" w:hAnsi="Symbol" w:hint="default"/>
-        <w:sz w:val="20"/>
-      </w:rPr>
-    </w:lvl>
-    <w:lvl w:ilvl="4" w:tentative="1">
-      <w:start w:val="1"/>
-      <w:numFmt w:val="bullet"/>
-      <w:lvlText w:val=""/>
-      <w:lvlJc w:val="left"/>
-      <w:pPr>
-        <w:tabs>
-          <w:tab w:val="num" w:pos="3600"/>
-        </w:tabs>
-        <w:ind w:left="3600" w:hanging="360"/>
-      </w:pPr>
-      <w:rPr>
-        <w:rFonts w:ascii="Symbol" w:hAnsi="Symbol" w:hint="default"/>
-        <w:sz w:val="20"/>
-      </w:rPr>
-    </w:lvl>
-    <w:lvl w:ilvl="5" w:tentative="1">
-      <w:start w:val="1"/>
-      <w:numFmt w:val="bullet"/>
-      <w:lvlText w:val=""/>
-      <w:lvlJc w:val="left"/>
-      <w:pPr>
-        <w:tabs>
-          <w:tab w:val="num" w:pos="4320"/>
-        </w:tabs>
-        <w:ind w:left="4320" w:hanging="360"/>
-      </w:pPr>
-      <w:rPr>
-        <w:rFonts w:ascii="Symbol" w:hAnsi="Symbol" w:hint="default"/>
-        <w:sz w:val="20"/>
-      </w:rPr>
-    </w:lvl>
-    <w:lvl w:ilvl="6" w:tentative="1">
-      <w:start w:val="1"/>
-      <w:numFmt w:val="bullet"/>
-      <w:lvlText w:val=""/>
-      <w:lvlJc w:val="left"/>
-      <w:pPr>
-        <w:tabs>
-          <w:tab w:val="num" w:pos="5040"/>
-        </w:tabs>
-        <w:ind w:left="5040" w:hanging="360"/>
-      </w:pPr>
-      <w:rPr>
-        <w:rFonts w:ascii="Symbol" w:hAnsi="Symbol" w:hint="default"/>
-        <w:sz w:val="20"/>
-      </w:rPr>
-    </w:lvl>
-    <w:lvl w:ilvl="7" w:tentative="1">
-      <w:start w:val="1"/>
-      <w:numFmt w:val="bullet"/>
-      <w:lvlText w:val=""/>
-      <w:lvlJc w:val="left"/>
-      <w:pPr>
-        <w:tabs>
-          <w:tab w:val="num" w:pos="5760"/>
-        </w:tabs>
-        <w:ind w:left="5760" w:hanging="360"/>
-      </w:pPr>
-      <w:rPr>
-        <w:rFonts w:ascii="Symbol" w:hAnsi="Symbol" w:hint="default"/>
-        <w:sz w:val="20"/>
-      </w:rPr>
-    </w:lvl>
-    <w:lvl w:ilvl="8" w:tentative="1">
-      <w:start w:val="1"/>
-      <w:numFmt w:val="bullet"/>
-      <w:lvlText w:val=""/>
-      <w:lvlJc w:val="left"/>
-      <w:pPr>
-        <w:tabs>
-          <w:tab w:val="num" w:pos="6480"/>
-        </w:tabs>
-        <w:ind w:left="6480" w:hanging="360"/>
-      </w:pPr>
-      <w:rPr>
-        <w:rFonts w:ascii="Symbol" w:hAnsi="Symbol" w:hint="default"/>
-        <w:sz w:val="20"/>
-      </w:rPr>
-    </w:lvl>
-  </w:abstractNum>
-  <w:num w:numId="1" w16cid:durableId="1658264573">
-    <w:abstractNumId w:val="2"/>
+  <w:num w:numId="1" w16cid:durableId="1589271001">
+    <w:abstractNumId w:val="3"/>
   </w:num>
-  <w:num w:numId="2" w16cid:durableId="850074201">
+  <w:num w:numId="2" w16cid:durableId="577516020">
     <w:abstractNumId w:val="0"/>
   </w:num>
-  <w:num w:numId="3" w16cid:durableId="1635525931">
+  <w:num w:numId="3" w16cid:durableId="548759900">
     <w:abstractNumId w:val="1"/>
   </w:num>
-  <w:num w:numId="4" w16cid:durableId="214586179">
-    <w:abstractNumId w:val="3"/>
+  <w:num w:numId="4" w16cid:durableId="394856452">
+    <w:abstractNumId w:val="2"/>
   </w:num>
 </w:numbering>
 </file>

</xml_diff>